<commit_message>
main update readme and word
</commit_message>
<xml_diff>
--- a/DiplomatervSablon_v3.2_hu.docx
+++ b/DiplomatervSablon_v3.2_hu.docx
@@ -435,7 +435,7 @@
         </w:rPr>
         <w:lastRenderedPageBreak/>
         <w:drawing>
-          <wp:inline distT="0" distB="0" distL="0" distR="0" wp14:anchorId="5D62D356" wp14:editId="0EDF4773">
+          <wp:inline distT="0" distB="0" distL="0" distR="0" wp14:anchorId="5D62D356" wp14:editId="6AA54D7D">
             <wp:extent cx="1933575" cy="542925"/>
             <wp:effectExtent l="0" t="0" r="0" b="0"/>
             <wp:docPr id="1" name="Kép 1"/>
@@ -2144,21 +2144,7 @@
             <w:rStyle w:val="Hyperlink"/>
             <w:noProof/>
           </w:rPr>
-          <w:t xml:space="preserve">4. Eredmények és </w:t>
-        </w:r>
-        <w:r>
-          <w:rPr>
-            <w:rStyle w:val="Hyperlink"/>
-            <w:noProof/>
-          </w:rPr>
-          <w:t>e</w:t>
-        </w:r>
-        <w:r>
-          <w:rPr>
-            <w:rStyle w:val="Hyperlink"/>
-            <w:noProof/>
-          </w:rPr>
-          <w:t>lemzés</w:t>
+          <w:t>4. Eredmények és elemzés</w:t>
         </w:r>
         <w:r>
           <w:rPr>
@@ -2302,35 +2288,7 @@
             <w:rStyle w:val="Hyperlink"/>
             <w:noProof/>
           </w:rPr>
-          <w:t>A mémekh</w:t>
-        </w:r>
-        <w:r>
-          <w:rPr>
-            <w:rStyle w:val="Hyperlink"/>
-            <w:noProof/>
-          </w:rPr>
-          <w:t>e</w:t>
-        </w:r>
-        <w:r>
-          <w:rPr>
-            <w:rStyle w:val="Hyperlink"/>
-            <w:noProof/>
-          </w:rPr>
-          <w:t xml:space="preserve">z </w:t>
-        </w:r>
-        <w:r>
-          <w:rPr>
-            <w:rStyle w:val="Hyperlink"/>
-            <w:noProof/>
-          </w:rPr>
-          <w:t>k</w:t>
-        </w:r>
-        <w:r>
-          <w:rPr>
-            <w:rStyle w:val="Hyperlink"/>
-            <w:noProof/>
-          </w:rPr>
-          <w:t>apcsolódó érzelmi töltet (meme sentiment) kiszámítására egy kísérleti, kétforrású megközelítés készült: (1) az OCR-rel kinyert szöveg FinBERT-alapú osztályozására, illetve (2) egy CLIP-alapú zero-shot prompt-páros („a positive meme” vs. „a negative meme”) képi hangulatelemzésére építve.</w:t>
+          <w:t>A mémekhez kapcsolódó érzelmi töltet (meme sentiment) kiszámítására egy kísérleti, kétforrású megközelítés készült: (1) az OCR-rel kinyert szöveg FinBERT-alapú osztályozására, illetve (2) egy CLIP-alapú zero-shot prompt-páros („a positive meme” vs. „a negative meme”) képi hangulatelemzésére építve.</w:t>
         </w:r>
         <w:r>
           <w:rPr>
@@ -4311,7 +4269,7 @@
         <w:rPr>
           <w:noProof/>
         </w:rPr>
-        <w:t>2025. 11. 30.</w:t>
+        <w:t>2025. 12. 06.</w:t>
       </w:r>
       <w:r>
         <w:fldChar w:fldCharType="end"/>
@@ -5800,7 +5758,25 @@
         <w:rPr>
           <w:noProof/>
         </w:rPr>
-        <w:pict w14:anchorId="2D82A6C3">
+        <w:fldChar w:fldCharType="begin"/>
+      </w:r>
+      <w:r>
+        <w:rPr>
+          <w:noProof/>
+        </w:rPr>
+        <w:instrText xml:space="preserve"> INCLUDEPICTURE  "https://www.researchgate.net/profile/Wangmeng-Zuo/publication/336361781/figure/fig1/AS:811931749326849@1570591022759/Comparison-of-various-attention-modules-ie-SENet-Hu-Shen-and-Sun-2018-CBAM-Woo.png" \* MERGEFORMATINET </w:instrText>
+      </w:r>
+      <w:r>
+        <w:rPr>
+          <w:noProof/>
+        </w:rPr>
+        <w:fldChar w:fldCharType="separate"/>
+      </w:r>
+      <w:r>
+        <w:rPr>
+          <w:noProof/>
+        </w:rPr>
+        <w:pict w14:anchorId="1EFB8D00">
           <v:shapetype id="_x0000_t75" coordsize="21600,21600" o:spt="75" o:preferrelative="t" path="m@4@5l@4@11@9@11@9@5xe" filled="f" stroked="f">
             <v:stroke joinstyle="miter"/>
             <v:formulas>
@@ -5820,10 +5796,16 @@
             <v:path o:extrusionok="f" gradientshapeok="t" o:connecttype="rect"/>
             <o:lock v:ext="edit" aspectratio="t"/>
           </v:shapetype>
-          <v:shape id="_x0000_i1025" type="#_x0000_t75" alt="" style="width:286.3pt;height:276pt;mso-width-percent:0;mso-height-percent:0;mso-width-percent:0;mso-height-percent:0">
+          <v:shape id="_x0000_i1025" type="#_x0000_t75" alt="" style="width:286pt;height:276pt;mso-width-percent:0;mso-height-percent:0;mso-width-percent:0;mso-height-percent:0">
             <v:imagedata r:id="rId12" r:href="rId13"/>
           </v:shape>
         </w:pict>
+      </w:r>
+      <w:r>
+        <w:rPr>
+          <w:noProof/>
+        </w:rPr>
+        <w:fldChar w:fldCharType="end"/>
       </w:r>
       <w:r>
         <w:fldChar w:fldCharType="end"/>
@@ -6666,7 +6648,13 @@
       <w:bookmarkStart w:id="19" w:name="_Toc215408736"/>
       <w:r>
         <w:lastRenderedPageBreak/>
-        <w:t>4. Eredmények és elemzés</w:t>
+        <w:t xml:space="preserve">4. </w:t>
+      </w:r>
+      <w:r>
+        <w:t>E</w:t>
+      </w:r>
+      <w:r>
+        <w:t>lemzés</w:t>
       </w:r>
       <w:bookmarkEnd w:id="19"/>
     </w:p>
@@ -6700,13 +6688,7 @@
         <w:rPr>
           <w:iCs w:val="0"/>
         </w:rPr>
-        <w:t>e</w:t>
-      </w:r>
-      <w:r>
-        <w:rPr>
-          <w:iCs w:val="0"/>
-        </w:rPr>
-        <w:t>ngagement</w:t>
+        <w:t>engagement</w:t>
       </w:r>
       <w:r>
         <w:t xml:space="preserve"> mutató</w:t>
@@ -7152,6 +7134,9 @@
         <w:t xml:space="preserve"> </w:t>
       </w:r>
       <w:r>
+        <w:rPr>
+          <w:noProof/>
+        </w:rPr>
         <w:drawing>
           <wp:inline distT="0" distB="0" distL="0" distR="0" wp14:anchorId="6627AE52" wp14:editId="1B576C34">
             <wp:extent cx="5231765" cy="3290131"/>
@@ -7406,96 +7391,279 @@
     </w:p>
     <w:p>
       <w:pPr>
-        <w:keepNext/>
-      </w:pPr>
-    </w:p>
-    <w:p>
-      <w:pPr>
-        <w:pStyle w:val="Caption"/>
-      </w:pPr>
-      <w:r>
-        <w:t xml:space="preserve">ábra </w:t>
-      </w:r>
-      <w:r>
-        <w:fldChar w:fldCharType="begin"/>
-      </w:r>
-      <w:r>
-        <w:instrText xml:space="preserve"> SEQ ábra \* ARABIC </w:instrText>
-      </w:r>
-      <w:r>
-        <w:fldChar w:fldCharType="separate"/>
-      </w:r>
-      <w:r>
-        <w:rPr>
-          <w:noProof/>
-        </w:rPr>
-        <w:t>8</w:t>
-      </w:r>
-      <w:r>
-        <w:fldChar w:fldCharType="end"/>
-      </w:r>
-      <w:r>
-        <w:t xml:space="preserve"> Negatív cikkek korrelációja a mémszámmal</w:t>
-      </w:r>
-    </w:p>
-    <w:p>
-      <w:pPr>
-        <w:keepNext/>
-      </w:pPr>
-    </w:p>
-    <w:p>
-      <w:pPr>
-        <w:pStyle w:val="Caption"/>
-      </w:pPr>
-      <w:r>
-        <w:t xml:space="preserve">ábra </w:t>
-      </w:r>
-      <w:r>
-        <w:fldChar w:fldCharType="begin"/>
-      </w:r>
-      <w:r>
-        <w:instrText xml:space="preserve"> SEQ ábra \* ARABIC </w:instrText>
-      </w:r>
-      <w:r>
-        <w:fldChar w:fldCharType="separate"/>
-      </w:r>
-      <w:r>
-        <w:rPr>
-          <w:noProof/>
-        </w:rPr>
-        <w:t>9</w:t>
-      </w:r>
-      <w:r>
-        <w:fldChar w:fldCharType="end"/>
+        <w:pStyle w:val="Heading2"/>
+        <w:rPr>
+          <w:sz w:val="48"/>
+          <w:szCs w:val="48"/>
+          <w:lang w:eastAsia="en-GB"/>
+        </w:rPr>
+      </w:pPr>
+      <w:bookmarkStart w:id="29" w:name="_Toc215408752"/>
+      <w:r>
+        <w:rPr>
+          <w:rStyle w:val="Strong"/>
+          <w:b w:val="0"/>
+          <w:bCs w:val="0"/>
+        </w:rPr>
+        <w:t>4.4 Cross-correlation és Granger-tesztek</w:t>
+      </w:r>
+    </w:p>
+    <w:p>
+      <w:pPr>
+        <w:pStyle w:val="Heading2"/>
+      </w:pPr>
+      <w:r>
+        <w:rPr>
+          <w:rStyle w:val="Strong"/>
+          <w:b w:val="0"/>
+          <w:bCs w:val="0"/>
+        </w:rPr>
+        <w:t>4.4.1 Cross-correlation (CCF) elemzés</w:t>
+      </w:r>
+    </w:p>
+    <w:p>
+      <w:pPr>
+        <w:pStyle w:val="NormalWeb"/>
+      </w:pPr>
+      <w:r>
+        <w:t>A New York Times-említések és a mémaktivitás időbeli kapcsolatának feltárására keresztkorrelációs elemzés (Cross-Correlation Function, CCF) készült. A módszer célja annak megvizsgálása, hogy a hírek intenzitása és a mémvolumen normalizált (z-score) értékei között kimutatható-e olyan időbeli együttmozgás, amely a két folyamat között vezető–követő struktúrára utal. A CCF a NYT-említések különböző késleltetett értékei és a mémvolumen közötti korrelációt méri, így alkalmas a lehetséges lead–lag mintázatok feltárására.</w:t>
+      </w:r>
+    </w:p>
+    <w:p>
+      <w:pPr>
+        <w:pStyle w:val="NormalWeb"/>
+      </w:pPr>
+      <w:r>
+        <w:t>Az eredmények alapján a keresztkorrelációs értékek egyik vizsgált lag esetében sem mutatnak statisztikailag vagy vizuálisan értelmezhető erős kapcsolatot. A korrelációs értékek minden késleltetésnél közel a nullához adódnak, a hozzájuk tartozó konfidenciaintervallumok pedig szélesek, ami a két változó közötti gyenge és zajos kapcsolatot jelzi. A CCF tehát nem tárt fel olyan egyértelmű mintázatot, amely alapján a hírek időben követnék a mémvolument, vagy fordítva: a nyilvánosság platformon megjelenő aktivitási hullámai előre jeleznék a későbbi médiamegjelenést.</w:t>
+      </w:r>
+    </w:p>
+    <w:p>
+      <w:pPr>
+        <w:pStyle w:val="NormalWeb"/>
+        <w:rPr>
+          <w:lang w:val="en-HU"/>
+        </w:rPr>
+      </w:pPr>
+      <w:r>
+        <w:t xml:space="preserve">Fontos megjegyezni, hogy a keresztkorreláció a nyers időbeli együttmozgást méri, és nem kontrollál az egyes idősorok autokorrelációjára, illetve trendszerkezetére. Így előfordulhat, hogy a valódi, gyenge prediktív kapcsolat a nyers korrelációs függvényben nem jelenik meg, különösen akkor, ha az adatok zajosak vagy a hatás csak feltételes modellezés mellett észlelhető. </w:t>
+      </w:r>
+      <w:r>
+        <w:rPr>
+          <w:lang w:val="en-HU"/>
+        </w:rPr>
+        <w:t xml:space="preserve">A </w:t>
+      </w:r>
+      <w:r>
+        <w:rPr>
+          <w:i/>
+          <w:iCs/>
+          <w:lang w:val="en-HU"/>
+        </w:rPr>
+        <w:t>feltételes modellezés</w:t>
+      </w:r>
+      <w:r>
+        <w:rPr>
+          <w:lang w:val="en-HU"/>
+        </w:rPr>
+        <w:t xml:space="preserve"> olyan eljárást jelöl, amelyben a modell figyelembe veszi az idősor saját múltbeli mintázatait (például autokorrelációját), és a vizsgált kapcsolatot ezek kontrollálása mellett azonosítja. </w:t>
+      </w:r>
+    </w:p>
+    <w:p>
+      <w:pPr>
+        <w:pStyle w:val="NormalWeb"/>
+      </w:pPr>
+      <w:r>
+        <w:t>Ennek megfelelően a CCF nem szolgált egyértelmű bizonyítékkal sem a hírek → mémek, sem a mémek → hírek irányú dinamikára, ezért szükségessé vált az oksági viszonyok formálisabb Granger-keretben történő tesztelése.</w:t>
+      </w:r>
+    </w:p>
+    <w:p>
+      <w:pPr>
+        <w:pStyle w:val="Heading2"/>
+      </w:pPr>
+      <w:r>
+        <w:rPr>
+          <w:rStyle w:val="Strong"/>
+          <w:b w:val="0"/>
+          <w:bCs w:val="0"/>
+        </w:rPr>
+        <w:lastRenderedPageBreak/>
+        <w:t>4.4.2 Granger-tesztek a mémvolumen és a hírsűrűség között</w:t>
+      </w:r>
+    </w:p>
+    <w:p>
+      <w:pPr>
+        <w:pStyle w:val="NormalWeb"/>
+      </w:pPr>
+      <w:r>
+        <w:t xml:space="preserve">A két folyamat közötti oksági irány vizsgálatához Granger-oksági tesztek kerültek alkalmazásra. A módszer azt vizsgálja, hogy az egyik idősor múltbeli értékeinek ismerete javítja-e a másik idősor előrejelzését a saját múltjára épülő modellhez képest. Ebben az értelemben az okság nem kauzális mechanizmust, hanem </w:t>
+      </w:r>
+      <w:r>
+        <w:rPr>
+          <w:rStyle w:val="Strong"/>
+        </w:rPr>
+        <w:t>időbeli előrejelző erőt</w:t>
+      </w:r>
+      <w:r>
+        <w:t xml:space="preserve"> jelent.</w:t>
+      </w:r>
+    </w:p>
+    <w:p>
+      <w:pPr>
+        <w:pStyle w:val="NormalWeb"/>
+      </w:pPr>
+      <w:r>
+        <w:t>A vizsgálat két irányban történt:</w:t>
       </w:r>
       <w:r>
         <w:t xml:space="preserve"> </w:t>
       </w:r>
-      <w:r>
-        <w:t>Pozitív</w:t>
-      </w:r>
-      <w:r>
-        <w:t xml:space="preserve"> cikkek korrelációja a mémszámmal</w:t>
-      </w:r>
-    </w:p>
-    <w:p>
-      <w:pPr>
-        <w:pStyle w:val="Caption"/>
-        <w:jc w:val="both"/>
-      </w:pPr>
-    </w:p>
-    <w:p>
-      <w:r>
-        <w:t>TODO</w:t>
+    </w:p>
+    <w:p>
+      <w:pPr>
+        <w:pStyle w:val="NormalWeb"/>
+      </w:pPr>
+      <w:r>
+        <w:rPr>
+          <w:rStyle w:val="Strong"/>
+        </w:rPr>
+        <w:t>(i) NYT-említések → mémvolumen</w:t>
+      </w:r>
+      <w:r>
+        <w:rPr>
+          <w:rStyle w:val="Strong"/>
+        </w:rPr>
+        <w:t>:</w:t>
+      </w:r>
+      <w:r>
+        <w:t xml:space="preserve"> </w:t>
+      </w:r>
+      <w:r>
+        <w:t>A tesztek egyetlen vizsgált késleltetés esetében sem mutattak 5%-os szinten szignifikáns hatást. Bár az egyhetes késleltetésnél a p-érték 0,076 körül alakul, ami gyenge kapcsolat lehetőségét vetíti előre, ez nem elegendő a nullhipotézis elutasításához. A rendelkezésre álló adatok alapján tehát nem bizonyítható, hogy a hírek intenzitása Granger-értelemben előre jelezné a későbbi mémaktivitást.</w:t>
+      </w:r>
+    </w:p>
+    <w:p>
+      <w:pPr>
+        <w:pStyle w:val="NormalWeb"/>
+      </w:pPr>
+      <w:r>
+        <w:rPr>
+          <w:rStyle w:val="Strong"/>
+        </w:rPr>
+        <w:t>(ii) mémvolumen → NYT-említések</w:t>
+      </w:r>
+      <w:r>
+        <w:t xml:space="preserve">: </w:t>
+      </w:r>
+      <w:r>
+        <w:t>Ezzel szemben az egyhetes késleltetés szignifikáns (p ≈ 0,017) eredményt adott, ami arra utal, hogy a megnövekedett mémvolumen statisztikailag kimutatható módon javítja a későbbi hírsűrűség előrejelzését. A hosszabb késleltetések esetében a hatás eltűnik, ami rövid, gyorsan lecsengő dinamikára utal: a média figyelme – legalábbis a New York Times esetében – elsősorban azonnal reagál az online aktivitás felerősödésére, és a kapcsolat nem tartós.</w:t>
+      </w:r>
+    </w:p>
+    <w:p>
+      <w:pPr>
+        <w:pStyle w:val="NormalWeb"/>
+      </w:pPr>
+      <w:r>
+        <w:t>A Granger-eredmények és a CCF eredményeinek összevetése fontos következtetéshez vezet:</w:t>
+      </w:r>
+      <w:r>
+        <w:br/>
+      </w:r>
+      <w:r>
+        <w:rPr>
+          <w:rStyle w:val="Strong"/>
+        </w:rPr>
+        <w:t>bár a nyers keresztkorreláció nem mutatott egyértelmű mintázatot, a Granger-keretben, ahol az autokorreláció hatásai kontrolláltak, kimutathatóvá válik egy rövid távú, memes → NYT irányú előrejelző kapcsolat.</w:t>
+      </w:r>
+      <w:r>
+        <w:t xml:space="preserve"> Ez azt sugallja, hogy a média bizonyos esetekben reagál a platformokon zajló aktivitásra, míg fordított irányban nem található statisztikailag alátámasztható előrejelző erő.</w:t>
+      </w:r>
+    </w:p>
+    <w:p>
+      <w:pPr>
+        <w:pStyle w:val="NormalWeb"/>
+        <w:rPr>
+          <w:lang w:val="en-HU"/>
+        </w:rPr>
+      </w:pPr>
+      <w:r>
+        <w:rPr>
+          <w:lang w:val="en-HU"/>
+        </w:rPr>
+        <w:t xml:space="preserve">A két eljárás együttes alkalmazása tehát árnyalt képet ad: a CCF vizuálisan nem mutat erős kapcsolatot, a Granger-keret azonban feltár egy rövid, egy lépéses memetikus előrejelző hatást, amely valószínűleg csak a </w:t>
+      </w:r>
+      <w:r>
+        <w:rPr>
+          <w:i/>
+          <w:iCs/>
+          <w:lang w:val="en-HU"/>
+        </w:rPr>
+        <w:t>feltételes modellezés</w:t>
+      </w:r>
+      <w:r>
+        <w:rPr>
+          <w:i/>
+          <w:iCs/>
+          <w:lang w:val="en-HU"/>
+        </w:rPr>
+        <w:t xml:space="preserve"> </w:t>
+      </w:r>
+      <w:r>
+        <w:rPr>
+          <w:lang w:val="en-HU"/>
+        </w:rPr>
+        <w:t>miatt válik kimutathatóvá.</w:t>
+      </w:r>
+      <w:r>
+        <w:rPr>
+          <w:lang w:val="en-HU"/>
+        </w:rPr>
+        <w:t xml:space="preserve"> </w:t>
+      </w:r>
+    </w:p>
+    <w:p>
+      <w:pPr>
+        <w:pStyle w:val="NormalWeb"/>
+        <w:rPr>
+          <w:lang w:val="en-HU"/>
+        </w:rPr>
+      </w:pPr>
+      <w:r>
+        <w:rPr>
+          <w:lang w:val="en-HU"/>
+        </w:rPr>
+        <w:t xml:space="preserve">Más szóval: nem a nyers együttmozgást vizsgálja, hanem azt, hogy az egyik változó múltja </w:t>
+      </w:r>
+      <w:r>
+        <w:rPr>
+          <w:b/>
+          <w:bCs/>
+          <w:lang w:val="en-HU"/>
+        </w:rPr>
+        <w:t>hozzáad-e</w:t>
+      </w:r>
+      <w:r>
+        <w:rPr>
+          <w:lang w:val="en-HU"/>
+        </w:rPr>
+        <w:t xml:space="preserve"> bármilyen plusz információt a másik változó előrejelzéséhez.</w:t>
+      </w:r>
+      <w:r>
+        <w:rPr>
+          <w:lang w:val="en-HU"/>
+        </w:rPr>
+        <w:t xml:space="preserve"> </w:t>
+      </w:r>
+      <w:r>
+        <w:lastRenderedPageBreak/>
+        <w:t>A teszt eredményei természetesen nem kauzális mechanizmust azonosítanak, hanem előrejelző struktúrát; a feltárt hatás így a média rövid távú reakciómintázataival áll összhangban, nem pedig oksági csatornákkal.</w:t>
       </w:r>
     </w:p>
     <w:p>
       <w:pPr>
         <w:pStyle w:val="Heading2"/>
       </w:pPr>
-      <w:bookmarkStart w:id="29" w:name="_Toc215408749"/>
-      <w:r>
-        <w:t>4.4 Cross-correlation és Granger-tesztek</w:t>
+      <w:r>
+        <w:t>4.5 Panel regresszió (TWFE)</w:t>
       </w:r>
       <w:bookmarkEnd w:id="29"/>
     </w:p>
@@ -7507,103 +7675,51 @@
           <w:numId w:val="0"/>
         </w:numPr>
       </w:pPr>
-      <w:bookmarkStart w:id="30" w:name="_Toc215408750"/>
-      <w:r>
-        <w:t>4.4.1 Cross-correlation (CCF) elemzés</w:t>
+      <w:bookmarkStart w:id="30" w:name="_Toc215408753"/>
+      <w:r>
+        <w:t>4.5.1 Modell specifikáció</w:t>
       </w:r>
       <w:bookmarkEnd w:id="30"/>
     </w:p>
     <w:p>
       <w:r>
-        <w:t>A hírek és a mémvolumen időbeli kapcsolatának feltárására keresztkorrelációs elemzés is készül, amely a New York Times-említések késleltetett értékei és a normalizált mémvolumen közötti együttmozgást vizsgálja. A módszer célja annak meghatározása, hogy a hírsűrűség és a platformon megjelenő aktivitási hullámok időben melyik irányba mutatnak kapcsolatot: a hírek növekedése megelőzi-e a mémtermelés fokozódását, vagy éppen a megnövekedett online aktivitás előzi meg az újságírói figyelem kiugrását. A keresztkorrelációs függvény a lead–lag mintázatok dinamikáját jeleníti meg, és segít az esemény-vizsgálatokból levont következtetések kiegészítésében</w:t>
-      </w:r>
-      <w:r>
-        <w:t>.</w:t>
-      </w:r>
-    </w:p>
-    <w:p>
-      <w:pPr>
-        <w:pStyle w:val="Heading3"/>
-        <w:numPr>
-          <w:ilvl w:val="0"/>
-          <w:numId w:val="0"/>
-        </w:numPr>
-      </w:pPr>
-      <w:bookmarkStart w:id="31" w:name="_Toc215408751"/>
-      <w:r>
-        <w:t>4.4.2 Granger-tesztek a memeszám és hírsentiment között</w:t>
-      </w:r>
-      <w:bookmarkEnd w:id="31"/>
-    </w:p>
-    <w:p>
-      <w:r>
-        <w:t>A hírhangnem és a mémvolumen közötti oksági irány vizsgálatához Granger-oksági tesztek kerülnek alkalmazásra. A teszt azt vizsgálja, hogy a hírsentiment múltbeli értékei javítják-e a mémvolumen előrejelzését az olyan modellekhez képest, amelyek kizárólag a mémvolumen saját múltjára támaszkodnak. Amennyiben a sentiment időben megelőző információt hordoz, a hírek tónusa Granger-értelemben okot jelent a későbbi mémaktivitásra. A tesztek így a lead–lag elemzés formálisabb ellenőrzését biztosítják, és kiegészítik az eseményablak körüli grafikus elemzéseket.</w:t>
-      </w:r>
-    </w:p>
-    <w:p>
-      <w:pPr>
-        <w:pStyle w:val="Heading2"/>
-      </w:pPr>
-      <w:bookmarkStart w:id="32" w:name="_Toc215408752"/>
+        <w:t>A panel regressziós elemzés alapját egy kétirányú fix hatásos (Two-Way Fixed Effects, TWFE) modell képezi, amely a márkák időben állandó sajátosságait, valamint az összes márkát érintő, héthez kötődő közös sokkokat különíti el. A módszer célja annak feltárása, hogy a New York Times márkaemlítései és a kapcsolódó hírsentiment milyen összefüggést mutatnak a mémaktivitás különböző mutatóival.</w:t>
+      </w:r>
+    </w:p>
+    <w:p>
+      <w:r>
+        <w:t xml:space="preserve">A modell három fő kimeneti változóval dolgozik: a log1p transzformációval normalizált heti mémvolumennel, a mémek átlagos sentimentértékével, valamint a log1p transzformált engagement-mutatóval. A fő magyarázóváltozókat az NYT-cikkek jelenlétét jelző bináris indikátor és </w:t>
+      </w:r>
+      <w:r>
+        <w:t>(</w:t>
+      </w:r>
+      <w:r>
+        <w:t>specifikációtól függően</w:t>
+      </w:r>
+      <w:r>
+        <w:t xml:space="preserve">) </w:t>
+      </w:r>
+      <w:r>
+        <w:t>az ezekből képzett mondatszintű hírsentiment adják. A hírek időben elnyúló hatását a modell az aktuális hét mellett legfeljebb négyhetes késleltetésekkel ragadja meg (k = 0…4). A négy késleltetésből álló alapváltozat mellett három-, kettő- és egyhetes lagstruktúrával készült robusztussági variánsok is szerepelnek.</w:t>
+      </w:r>
+    </w:p>
+    <w:p>
+      <w:r>
+        <w:t>A specifikáció minden esetben tartalmazza a reddit_activity_{t−1} változót, amely az adott márkához kapcsolódó subreddit megelőző heti aktivitását méri. Ez az idősoros kontroll a platformforgalom olyan ingadozásait szűri ki, amelyek az NYT-től függetlenül is képesek befolyásolni a mémek mennyiségét vagy érzelmi tónusát. A változó késleltetett formában kerül a modellbe, elkerülve ezzel a szimultaneitás és a „bad control” típusú torzítások kialakulását.</w:t>
+      </w:r>
+    </w:p>
+    <w:p>
+      <w:r>
+        <w:t xml:space="preserve">A hírsentiment csak azokban a hetekben rendelkezik értékkel, amelyekben az adott márkáról legalább egy New York Times-cikk megjelent. A sentimentváltozó lefedettsége ezért nem teljes: a tárgyhéten a brand–hetek körülbelül 44%-ában, míg az aktuális héttel és a késleltetett értékekkel együtt vizsgált többhetes ablakban mindössze mintegy 23,5%-ában áll rendelkezésre. Ez a hiányosság azt eredményezi, hogy a sentimentre épülő specifikációk szükségszerűen kisebb és szelektált mintán becsülhetők, </w:t>
+      </w:r>
       <w:r>
         <w:lastRenderedPageBreak/>
-        <w:t>4.5 Panel regresszió (TWFE)</w:t>
-      </w:r>
-      <w:bookmarkEnd w:id="32"/>
-    </w:p>
-    <w:p>
-      <w:pPr>
-        <w:pStyle w:val="Heading3"/>
-        <w:numPr>
-          <w:ilvl w:val="0"/>
-          <w:numId w:val="0"/>
-        </w:numPr>
-      </w:pPr>
-      <w:bookmarkStart w:id="33" w:name="_Toc215408753"/>
-      <w:r>
-        <w:t>4.5.1 Modell specifikáció</w:t>
-      </w:r>
-      <w:bookmarkEnd w:id="33"/>
-    </w:p>
-    <w:p>
-      <w:r>
-        <w:t>A panel regressziós elemzés alapját egy kétirányú fix hatásos (Two-Way Fixed Effects, TWFE) modell képezi, amely a márkák időben állandó sajátosságait, valamint az összes márkát érintő, héthez kötődő közös sokkokat különíti el. A módszer célja annak feltárása, hogy a New York Times márkaemlítései és a kapcsolódó hírsentiment milyen összefüggést mutatnak a mémaktivitás különböző mutatóival.</w:t>
-      </w:r>
-    </w:p>
-    <w:p>
-      <w:r>
-        <w:t xml:space="preserve">A modell három fő kimeneti változóval dolgozik: a log1p transzformációval normalizált heti mémvolumennel, a mémek átlagos sentimentértékével, valamint a log1p transzformált engagement-mutatóval. A fő magyarázóváltozókat az NYT-cikkek jelenlétét jelző bináris indikátor és </w:t>
-      </w:r>
-      <w:r>
-        <w:t>(</w:t>
-      </w:r>
-      <w:r>
-        <w:t>specifikációtól függően</w:t>
-      </w:r>
-      <w:r>
-        <w:t xml:space="preserve">) </w:t>
-      </w:r>
-      <w:r>
-        <w:t>az ezekből képzett mondatszintű hírsentiment adják. A hírek időben elnyúló hatását a modell az aktuális hét mellett legfeljebb négyhetes késleltetésekkel ragadja meg (k = 0…4). A négy késleltetésből álló alapváltozat mellett három-, kettő- és egyhetes lagstruktúrával készült robusztussági variánsok is szerepelnek.</w:t>
-      </w:r>
-    </w:p>
-    <w:p>
-      <w:r>
-        <w:t>A specifikáció minden esetben tartalmazza a reddit_activity_{t−1} változót, amely az adott márkához kapcsolódó subreddit megelőző heti aktivitását méri. Ez az idősoros kontroll a platformforgalom olyan ingadozásait szűri ki, amelyek az NYT-től függetlenül is képesek befolyásolni a mémek mennyiségét vagy érzelmi tónusát. A változó késleltetett formában kerül a modellbe, elkerülve ezzel a szimultaneitás és a „bad control” típusú torzítások kialakulását.</w:t>
-      </w:r>
-    </w:p>
-    <w:p>
-      <w:r>
-        <w:t>A hírsentiment csak azokban a hetekben rendelkezik értékkel, amelyekben az adott márkáról legalább egy New York Times-cikk megjelent. A sentimentváltozó lefedettsége ezért nem teljes: a tárgyhéten a brand–hetek körülbelül 44%-ában, míg az aktuális héttel és a késleltetett értékekkel együtt vizsgált többhetes ablakban mindössze mintegy 23,5%-ában áll rendelkezésre. Ez a hiányosság azt eredményezi, hogy a sentimentre épülő specifikációk szükségszerűen kisebb és szelektált mintán becsülhetők, ami összehasonlíthatósági problémákat vetne fel, ha kizárólag ezekre támaszkodna az elemzés.</w:t>
-      </w:r>
-    </w:p>
-    <w:p>
-      <w:r>
-        <w:t xml:space="preserve">A mintaredukció torzító hatásainak elkerülése és a teljes panel információtartalmának megőrzése érdekében két modellcsalád kerül becslésre. A </w:t>
-      </w:r>
-      <w:r>
-        <w:lastRenderedPageBreak/>
-        <w:t>„mention-only” modellek az összes megfigyelt brand–hetet felhasználják, és a NYT-említések késleltetett értékei a cikkhiányt egyszerűen nullával jelzik. Ez a konstrukció lehetővé teszi, hogy a teljes mintán értékelhető legyen a médiamegjelenés ténye mint expozíció, függetlenül annak érzelmi tartalmától. A „with sentiment” modellek ezzel szemben kizárólag azokat a megfigyeléseket tartják meg, amelyekben a sentimentérték az adott lagablakon belül minden héten rendelkezésre áll, így ezek célzottan a hírek érzelmi irányultságának hatását azonosítják. A két modellcsalád párhuzamos használata biztosítja, hogy elkülöníthető legyen a médiamegjelenés puszta tényének hatása a sentiment által hordozott többletinformációtól, miközben megmarad a becslések közötti teljes körű összehasonlíthatóság.</w:t>
+        <w:t>ami összehasonlíthatósági problémákat vetne fel, ha kizárólag ezekre támaszkodna az elemzés.</w:t>
+      </w:r>
+    </w:p>
+    <w:p>
+      <w:r>
+        <w:t>A mintaredukció torzító hatásainak elkerülése és a teljes panel információtartalmának megőrzése érdekében két modellcsalád kerül becslésre. A „mention-only” modellek az összes megfigyelt brand–hetet felhasználják, és a NYT-említések késleltetett értékei a cikkhiányt egyszerűen nullával jelzik. Ez a konstrukció lehetővé teszi, hogy a teljes mintán értékelhető legyen a médiamegjelenés ténye mint expozíció, függetlenül annak érzelmi tartalmától. A „with sentiment” modellek ezzel szemben kizárólag azokat a megfigyeléseket tartják meg, amelyekben a sentimentérték az adott lagablakon belül minden héten rendelkezésre áll, így ezek célzottan a hírek érzelmi irányultságának hatását azonosítják. A két modellcsalád párhuzamos használata biztosítja, hogy elkülöníthető legyen a médiamegjelenés puszta tényének hatása a sentiment által hordozott többletinformációtól, miközben megmarad a becslések közötti teljes körű összehasonlíthatóság.</w:t>
       </w:r>
     </w:p>
     <w:p>
@@ -7761,7 +7877,7 @@
           </m:sub>
         </m:sSub>
       </m:oMath>
-      <w:bookmarkStart w:id="34" w:name="_Toc332797397"/>
+      <w:bookmarkStart w:id="31" w:name="_Toc332797397"/>
       <w:r>
         <w:t xml:space="preserve"> </w:t>
       </w:r>
@@ -7784,7 +7900,7 @@
           <w:szCs w:val="24"/>
         </w:rPr>
       </w:pPr>
-      <w:bookmarkStart w:id="35" w:name="_Toc215408754"/>
+      <w:bookmarkStart w:id="32" w:name="_Toc215408754"/>
       <w:r>
         <w:rPr>
           <w:rFonts w:cs="Times New Roman"/>
@@ -7795,7 +7911,7 @@
         <w:lastRenderedPageBreak/>
         <w:t>A becslésből származó koefficienspályák minden kimeneti változóra és minden lagablakra külön kerülnek exportálásra, és ezek szolgálnak alapul a későbbi grafikus és táblázatos eredményösszegzésekhez.</w:t>
       </w:r>
-      <w:bookmarkEnd w:id="35"/>
+      <w:bookmarkEnd w:id="32"/>
     </w:p>
     <w:p>
       <w:pPr>
@@ -7807,6 +7923,9 @@
     </w:p>
     <w:p>
       <w:r>
+        <w:rPr>
+          <w:noProof/>
+        </w:rPr>
         <w:drawing>
           <wp:inline distT="0" distB="0" distL="0" distR="0" wp14:anchorId="35EE87B5" wp14:editId="78C0BD4D">
             <wp:extent cx="4320254" cy="2880000"/>
@@ -7870,17 +7989,20 @@
         <w:rPr>
           <w:noProof/>
         </w:rPr>
-        <w:t>10</w:t>
+        <w:t>8</w:t>
       </w:r>
       <w:r>
         <w:fldChar w:fldCharType="end"/>
       </w:r>
       <w:r>
-        <w:t xml:space="preserve"> Negatív </w:t>
-      </w:r>
-    </w:p>
-    <w:p>
-      <w:r>
+        <w:t xml:space="preserve"> Negatív cikkek korrelációja a mémszámmal</w:t>
+      </w:r>
+    </w:p>
+    <w:p>
+      <w:r>
+        <w:rPr>
+          <w:noProof/>
+        </w:rPr>
         <w:drawing>
           <wp:inline distT="0" distB="0" distL="0" distR="0" wp14:anchorId="3F84B0B3" wp14:editId="6EFE7EB5">
             <wp:extent cx="4320254" cy="2880000"/>
@@ -7944,11 +8066,17 @@
         <w:rPr>
           <w:noProof/>
         </w:rPr>
-        <w:t>11</w:t>
+        <w:t>9</w:t>
       </w:r>
       <w:r>
         <w:fldChar w:fldCharType="end"/>
       </w:r>
+      <w:r>
+        <w:t xml:space="preserve"> </w:t>
+      </w:r>
+      <w:r>
+        <w:t>Pozitív cikkek korrelációja a mémszámmal</w:t>
+      </w:r>
     </w:p>
     <w:p>
       <w:pPr>
@@ -7959,12 +8087,12 @@
       <w:pPr>
         <w:pStyle w:val="Heading2"/>
       </w:pPr>
-      <w:bookmarkStart w:id="36" w:name="_Toc215408755"/>
+      <w:bookmarkStart w:id="33" w:name="_Toc215408755"/>
       <w:r>
         <w:lastRenderedPageBreak/>
         <w:t>4.6 Összegzés és következtetések</w:t>
       </w:r>
-      <w:bookmarkEnd w:id="36"/>
+      <w:bookmarkEnd w:id="33"/>
     </w:p>
     <w:p>
       <w:pPr>
@@ -7997,7 +8125,7 @@
       <w:r>
         <w:fldChar w:fldCharType="end"/>
       </w:r>
-      <w:bookmarkEnd w:id="34"/>
+      <w:bookmarkEnd w:id="31"/>
     </w:p>
     <w:p>
       <w:pPr>
@@ -8008,13 +8136,13 @@
         </w:numPr>
         <w:ind w:left="2880"/>
       </w:pPr>
-      <w:bookmarkStart w:id="37" w:name="_Toc332797402"/>
-      <w:bookmarkStart w:id="38" w:name="_Toc215408756"/>
+      <w:bookmarkStart w:id="34" w:name="_Toc332797402"/>
+      <w:bookmarkStart w:id="35" w:name="_Toc215408756"/>
       <w:r>
         <w:t>Irodalomjegyzék</w:t>
       </w:r>
-      <w:bookmarkEnd w:id="37"/>
-      <w:bookmarkEnd w:id="38"/>
+      <w:bookmarkEnd w:id="34"/>
+      <w:bookmarkEnd w:id="35"/>
     </w:p>
     <w:p>
       <w:r>
@@ -8081,14 +8209,14 @@
       <w:pPr>
         <w:pStyle w:val="Heading1"/>
       </w:pPr>
-      <w:bookmarkStart w:id="39" w:name="_Toc332797403"/>
-      <w:bookmarkStart w:id="40" w:name="_Toc215408757"/>
+      <w:bookmarkStart w:id="36" w:name="_Toc332797403"/>
+      <w:bookmarkStart w:id="37" w:name="_Toc215408757"/>
       <w:r>
         <w:lastRenderedPageBreak/>
         <w:t>Utolsó simítások</w:t>
       </w:r>
-      <w:bookmarkEnd w:id="39"/>
-      <w:bookmarkEnd w:id="40"/>
+      <w:bookmarkEnd w:id="36"/>
+      <w:bookmarkEnd w:id="37"/>
     </w:p>
     <w:p>
       <w:r>
@@ -8151,18 +8279,18 @@
       <w:pPr>
         <w:pStyle w:val="Fejezetcimszmozsnlkl"/>
       </w:pPr>
-      <w:bookmarkStart w:id="41" w:name="_Toc215408758"/>
+      <w:bookmarkStart w:id="38" w:name="_Toc215408758"/>
       <w:r>
         <w:lastRenderedPageBreak/>
         <w:t>Irodalomjegyzék</w:t>
       </w:r>
-      <w:bookmarkEnd w:id="41"/>
+      <w:bookmarkEnd w:id="38"/>
     </w:p>
     <w:p>
       <w:pPr>
         <w:pStyle w:val="Irodalomjegyzksor"/>
       </w:pPr>
-      <w:bookmarkStart w:id="42" w:name="_Ref332797594"/>
+      <w:bookmarkStart w:id="39" w:name="_Ref332797594"/>
       <w:r>
         <w:t>Levendovszky, J., Jereb, L.,</w:t>
       </w:r>
@@ -8184,7 +8312,7 @@
       <w:r>
         <w:t>, Vol. 48, 2002, pp. 225-236</w:t>
       </w:r>
-      <w:bookmarkEnd w:id="42"/>
+      <w:bookmarkEnd w:id="39"/>
     </w:p>
     <w:p>
       <w:pPr>
@@ -8287,28 +8415,28 @@
       <w:pPr>
         <w:pStyle w:val="Fejezetcimszmozsnlkl"/>
       </w:pPr>
-      <w:bookmarkStart w:id="43" w:name="_Toc215408759"/>
+      <w:bookmarkStart w:id="40" w:name="_Toc215408759"/>
       <w:r>
         <w:lastRenderedPageBreak/>
         <w:t>Függelék</w:t>
       </w:r>
-      <w:bookmarkEnd w:id="43"/>
+      <w:bookmarkEnd w:id="40"/>
     </w:p>
     <w:p>
       <w:pPr>
         <w:pStyle w:val="Heading2"/>
       </w:pPr>
-      <w:bookmarkStart w:id="44" w:name="_Toc215408760"/>
+      <w:bookmarkStart w:id="41" w:name="_Toc215408760"/>
       <w:r>
         <w:t>5.1 Márka szinonima lista</w:t>
       </w:r>
-      <w:bookmarkEnd w:id="44"/>
+      <w:bookmarkEnd w:id="41"/>
     </w:p>
     <w:p>
       <w:pPr>
         <w:pStyle w:val="Heading2"/>
       </w:pPr>
-      <w:bookmarkStart w:id="45" w:name="_Toc215408761"/>
+      <w:bookmarkStart w:id="42" w:name="_Toc215408761"/>
       <w:r>
         <w:t>5.2</w:t>
       </w:r>
@@ -8318,7 +8446,7 @@
       <w:r>
         <w:t>Heti memeszám és hírsentiment idődiagramok</w:t>
       </w:r>
-      <w:bookmarkEnd w:id="45"/>
+      <w:bookmarkEnd w:id="42"/>
     </w:p>
     <w:p>
       <w:pPr>
@@ -8331,7 +8459,7 @@
           <w:noProof/>
         </w:rPr>
         <w:drawing>
-          <wp:inline distT="0" distB="0" distL="0" distR="0" wp14:anchorId="4172DE6B" wp14:editId="0920CD2F">
+          <wp:inline distT="0" distB="0" distL="0" distR="0" wp14:anchorId="4172DE6B" wp14:editId="44F79F41">
             <wp:extent cx="3601149" cy="1400400"/>
             <wp:effectExtent l="0" t="0" r="5715" b="0"/>
             <wp:docPr id="108407479" name="Picture 23" descr="A graph of a graph of a graph&#10;&#10;AI-generated content may be incorrect."/>
@@ -8413,7 +8541,7 @@
           <w:noProof/>
         </w:rPr>
         <w:drawing>
-          <wp:inline distT="0" distB="0" distL="0" distR="0" wp14:anchorId="0D2B73B9" wp14:editId="43EA2882">
+          <wp:inline distT="0" distB="0" distL="0" distR="0" wp14:anchorId="0D2B73B9" wp14:editId="5FC934B3">
             <wp:extent cx="3600000" cy="1399953"/>
             <wp:effectExtent l="0" t="0" r="0" b="0"/>
             <wp:docPr id="1446051674" name="Picture 24" descr="A graph with red and blue lines&#10;&#10;AI-generated content may be incorrect."/>
@@ -8495,7 +8623,7 @@
           <w:noProof/>
         </w:rPr>
         <w:drawing>
-          <wp:inline distT="0" distB="0" distL="0" distR="0" wp14:anchorId="547D6F6E" wp14:editId="1820F881">
+          <wp:inline distT="0" distB="0" distL="0" distR="0" wp14:anchorId="547D6F6E" wp14:editId="6A5F2988">
             <wp:extent cx="3600000" cy="1399953"/>
             <wp:effectExtent l="0" t="0" r="0" b="0"/>
             <wp:docPr id="1820479288" name="Picture 25" descr="A graph of a graph showing the difference between a line and a line&#10;&#10;AI-generated content may be incorrect."/>
@@ -8563,10 +8691,7 @@
         <w:fldChar w:fldCharType="end"/>
       </w:r>
       <w:r>
-        <w:t xml:space="preserve"> Facebook </w:t>
-      </w:r>
-      <w:r>
-        <w:t>mém-cikk idődiagram</w:t>
+        <w:t xml:space="preserve"> Facebook mém-cikk idődiagram</w:t>
       </w:r>
     </w:p>
     <w:p>
@@ -8581,7 +8706,7 @@
         </w:rPr>
         <w:lastRenderedPageBreak/>
         <w:drawing>
-          <wp:inline distT="0" distB="0" distL="0" distR="0" wp14:anchorId="7E101F98" wp14:editId="41F9683E">
+          <wp:inline distT="0" distB="0" distL="0" distR="0" wp14:anchorId="7E101F98" wp14:editId="5EB895FE">
             <wp:extent cx="3600000" cy="1399953"/>
             <wp:effectExtent l="0" t="0" r="0" b="0"/>
             <wp:docPr id="1091383706" name="Picture 26" descr="A graph of a line graph&#10;&#10;AI-generated content may be incorrect."/>
@@ -8649,10 +8774,7 @@
         <w:fldChar w:fldCharType="end"/>
       </w:r>
       <w:r>
-        <w:t xml:space="preserve"> Instagram </w:t>
-      </w:r>
-      <w:r>
-        <w:t>mém-cikk idődiagram</w:t>
+        <w:t xml:space="preserve"> Instagram mém-cikk idődiagram</w:t>
       </w:r>
     </w:p>
     <w:p>
@@ -8666,7 +8788,7 @@
           <w:noProof/>
         </w:rPr>
         <w:drawing>
-          <wp:inline distT="0" distB="0" distL="0" distR="0" wp14:anchorId="2F724E91" wp14:editId="3E40408E">
+          <wp:inline distT="0" distB="0" distL="0" distR="0" wp14:anchorId="2F724E91" wp14:editId="456F6D15">
             <wp:extent cx="3600000" cy="1399953"/>
             <wp:effectExtent l="0" t="0" r="0" b="0"/>
             <wp:docPr id="328703387" name="Picture 27" descr="A graph of a graph showing the same value&#10;&#10;AI-generated content may be incorrect."/>
@@ -8734,10 +8856,7 @@
         <w:fldChar w:fldCharType="end"/>
       </w:r>
       <w:r>
-        <w:t xml:space="preserve"> Microsoft </w:t>
-      </w:r>
-      <w:r>
-        <w:t>mém-cikk idődiagram</w:t>
+        <w:t xml:space="preserve"> Microsoft mém-cikk idődiagram</w:t>
       </w:r>
     </w:p>
     <w:p>
@@ -8751,7 +8870,7 @@
           <w:noProof/>
         </w:rPr>
         <w:drawing>
-          <wp:inline distT="0" distB="0" distL="0" distR="0" wp14:anchorId="01C0E21C" wp14:editId="247882D7">
+          <wp:inline distT="0" distB="0" distL="0" distR="0" wp14:anchorId="01C0E21C" wp14:editId="1D64F749">
             <wp:extent cx="3600000" cy="1399953"/>
             <wp:effectExtent l="0" t="0" r="0" b="0"/>
             <wp:docPr id="1583338737" name="Picture 28" descr="A graph showing a red and blue line&#10;&#10;AI-generated content may be incorrect."/>
@@ -8819,10 +8938,7 @@
         <w:fldChar w:fldCharType="end"/>
       </w:r>
       <w:r>
-        <w:t xml:space="preserve"> Netflix </w:t>
-      </w:r>
-      <w:r>
-        <w:t>mém-cikk idődiagram</w:t>
+        <w:t xml:space="preserve"> Netflix mém-cikk idődiagram</w:t>
       </w:r>
     </w:p>
     <w:p>
@@ -8836,7 +8952,7 @@
           <w:noProof/>
         </w:rPr>
         <w:drawing>
-          <wp:inline distT="0" distB="0" distL="0" distR="0" wp14:anchorId="06C569D9" wp14:editId="72B853EC">
+          <wp:inline distT="0" distB="0" distL="0" distR="0" wp14:anchorId="06C569D9" wp14:editId="1EB83F66">
             <wp:extent cx="3600000" cy="1399953"/>
             <wp:effectExtent l="0" t="0" r="0" b="0"/>
             <wp:docPr id="189274540" name="Picture 29" descr="A graph with red and blue lines&#10;&#10;AI-generated content may be incorrect."/>
@@ -8904,10 +9020,7 @@
         <w:fldChar w:fldCharType="end"/>
       </w:r>
       <w:r>
-        <w:t xml:space="preserve"> Spotify </w:t>
-      </w:r>
-      <w:r>
-        <w:t>mém-cikk idődiagram</w:t>
+        <w:t xml:space="preserve"> Spotify mém-cikk idődiagram</w:t>
       </w:r>
     </w:p>
     <w:p>
@@ -8922,7 +9035,7 @@
         </w:rPr>
         <w:lastRenderedPageBreak/>
         <w:drawing>
-          <wp:inline distT="0" distB="0" distL="0" distR="0" wp14:anchorId="66BE5E74" wp14:editId="7F1C10AA">
+          <wp:inline distT="0" distB="0" distL="0" distR="0" wp14:anchorId="66BE5E74" wp14:editId="494CB493">
             <wp:extent cx="3600000" cy="1399953"/>
             <wp:effectExtent l="0" t="0" r="0" b="0"/>
             <wp:docPr id="456254425" name="Picture 30" descr="A graph with blue and red lines&#10;&#10;AI-generated content may be incorrect."/>
@@ -8990,10 +9103,7 @@
         <w:fldChar w:fldCharType="end"/>
       </w:r>
       <w:r>
-        <w:t xml:space="preserve"> Tesla </w:t>
-      </w:r>
-      <w:r>
-        <w:t>mém-cikk idődiagram</w:t>
+        <w:t xml:space="preserve"> Tesla mém-cikk idődiagram</w:t>
       </w:r>
     </w:p>
     <w:p>
@@ -9007,7 +9117,7 @@
           <w:noProof/>
         </w:rPr>
         <w:drawing>
-          <wp:inline distT="0" distB="0" distL="0" distR="0" wp14:anchorId="70C46339" wp14:editId="0EDE3ECE">
+          <wp:inline distT="0" distB="0" distL="0" distR="0" wp14:anchorId="70C46339" wp14:editId="5840CEDC">
             <wp:extent cx="3600000" cy="1399953"/>
             <wp:effectExtent l="0" t="0" r="0" b="0"/>
             <wp:docPr id="708702957" name="Picture 31" descr="A graph of a graph of a graph&#10;&#10;AI-generated content may be incorrect."/>
@@ -9075,10 +9185,7 @@
         <w:fldChar w:fldCharType="end"/>
       </w:r>
       <w:r>
-        <w:t xml:space="preserve"> Youtube </w:t>
-      </w:r>
-      <w:r>
-        <w:t>mém-cikk idődiagram</w:t>
+        <w:t xml:space="preserve"> Youtube mém-cikk idődiagram</w:t>
       </w:r>
     </w:p>
     <w:p/>
@@ -9092,6 +9199,9 @@
     </w:p>
     <w:p>
       <w:r>
+        <w:rPr>
+          <w:noProof/>
+        </w:rPr>
         <w:drawing>
           <wp:inline distT="0" distB="0" distL="0" distR="0" wp14:anchorId="0FF4CA0F" wp14:editId="1CBC86D5">
             <wp:extent cx="4292600" cy="2933700"/>
@@ -9131,6 +9241,9 @@
     </w:p>
     <w:p>
       <w:r>
+        <w:rPr>
+          <w:noProof/>
+        </w:rPr>
         <w:lastRenderedPageBreak/>
         <w:drawing>
           <wp:inline distT="0" distB="0" distL="0" distR="0" wp14:anchorId="3358F503" wp14:editId="2F574888">
@@ -9173,7 +9286,7 @@
       <w:pPr>
         <w:pStyle w:val="Heading2"/>
       </w:pPr>
-      <w:bookmarkStart w:id="46" w:name="_Toc215408762"/>
+      <w:bookmarkStart w:id="43" w:name="_Toc215408762"/>
       <w:r>
         <w:t>5.</w:t>
       </w:r>
@@ -9186,37 +9299,19 @@
       <w:r>
         <w:t>Kísérleti mém-sentiment becslés (OCR + FinBERT + CLIP)</w:t>
       </w:r>
-      <w:bookmarkEnd w:id="46"/>
+      <w:bookmarkEnd w:id="43"/>
       <w:r>
         <w:t xml:space="preserve"> </w:t>
       </w:r>
     </w:p>
     <w:p>
       <w:r>
-        <w:t>Ebben a kísérleti modulban a mémek érzelmi töltetének becslésére egy multimodális, kétkomponensű megközelítés készült. A módszer (1) az OCR-rel kinyert szöveg FinBERT-alapú osztályozását, valamint (2) egy CLIP-modellel végzett zero-shot</w:t>
-      </w:r>
-      <w:r>
-        <w:t xml:space="preserve"> </w:t>
-      </w:r>
-      <w:r>
-        <w:t>promptos hangulatelemzést („a positive meme” vs. „a negative meme”) kombinálja. A két modell külön-külön előállított</w:t>
-      </w:r>
-      <w:r>
-        <w:t xml:space="preserve"> </w:t>
-      </w:r>
-      <w:r>
-        <w:t>pozitív–negatív valószínűségeinek különbsége átlagolásra került, így jött létre a `mean_meme_sentiment` változó.</w:t>
-      </w:r>
-    </w:p>
-    <w:p>
-      <w:r>
-        <w:t xml:space="preserve">A megközelítés azonban nem bizonyult megbízhatónak: a végső panelváltozó gyakorlatilag semmilyen kapcsolatot nem mutat </w:t>
-      </w:r>
-      <w:r>
-        <w:t>s</w:t>
-      </w:r>
-      <w:r>
-        <w:t xml:space="preserve">em a hírsentimenttel, sem a mémvolumen mutatóival, sem az engagement-tel. Ez módszertanilag várható, mivel </w:t>
+        <w:t>Ebben a kísérleti modulban a mémek érzelmi töltetének becslésére egy multimodális, kétkomponensű megközelítés készült. A módszer (1) az OCR-rel kinyert szöveg FinBERT-alapú osztályozását, valamint (2) egy CLIP-modellel végzett zero-shot promptos hangulatelemzést („a positive meme” vs. „a negative meme”) kombinálja. A két modell külön-külön előállított pozitív–negatív valószínűségeinek különbsége átlagolásra került, így jött létre a `mean_meme_sentiment` változó.</w:t>
+      </w:r>
+    </w:p>
+    <w:p>
+      <w:r>
+        <w:t xml:space="preserve">A megközelítés azonban nem bizonyult megbízhatónak: a végső panelváltozó gyakorlatilag semmilyen kapcsolatot nem mutat sem a hírsentimenttel, sem a mémvolumen mutatóival, sem az engagement-tel. Ez módszertanilag várható, mivel </w:t>
       </w:r>
     </w:p>
     <w:p>
@@ -9251,14 +9346,7 @@
           <w:b/>
           <w:bCs/>
         </w:rPr>
-        <w:t>nem került b</w:t>
-      </w:r>
-      <w:r>
-        <w:rPr>
-          <w:b/>
-          <w:bCs/>
-        </w:rPr>
-        <w:t>e</w:t>
+        <w:t>nem került be</w:t>
       </w:r>
       <w:r>
         <w:t xml:space="preserve"> sem az eseményvizsgálatokba, sem a panelregressziós specifikációkba.</w:t>
@@ -9268,7 +9356,7 @@
       <w:pPr>
         <w:pStyle w:val="Heading2"/>
       </w:pPr>
-      <w:bookmarkStart w:id="47" w:name="_Toc215408763"/>
+      <w:bookmarkStart w:id="44" w:name="_Toc215408763"/>
       <w:r>
         <w:lastRenderedPageBreak/>
         <w:t>5.</w:t>
@@ -9279,7 +9367,7 @@
       <w:r>
         <w:t>. Diagnosztikai elemzések</w:t>
       </w:r>
-      <w:bookmarkEnd w:id="47"/>
+      <w:bookmarkEnd w:id="44"/>
       <w:r>
         <w:t xml:space="preserve"> </w:t>
       </w:r>
@@ -12540,8 +12628,9 @@
     <w:lsdException w:name="toc 3" w:uiPriority="39"/>
     <w:lsdException w:name="caption" w:uiPriority="35" w:qFormat="1"/>
     <w:lsdException w:name="Hyperlink" w:uiPriority="99"/>
-    <w:lsdException w:name="Strong" w:qFormat="1"/>
+    <w:lsdException w:name="Strong" w:uiPriority="22" w:qFormat="1"/>
     <w:lsdException w:name="Emphasis" w:qFormat="1"/>
+    <w:lsdException w:name="Normal (Web)" w:uiPriority="99"/>
     <w:lsdException w:name="HTML Keyboard" w:semiHidden="1" w:unhideWhenUsed="1"/>
     <w:lsdException w:name="Normal Table" w:semiHidden="1" w:unhideWhenUsed="1"/>
     <w:lsdException w:name="annotation subject" w:semiHidden="1" w:unhideWhenUsed="1"/>
@@ -13729,6 +13818,7 @@
   </w:style>
   <w:style w:type="character" w:styleId="Strong">
     <w:name w:val="Strong"/>
+    <w:uiPriority w:val="22"/>
     <w:qFormat/>
     <w:rsid w:val="003F5425"/>
     <w:rPr>
@@ -13860,6 +13950,7 @@
   <w:style w:type="paragraph" w:styleId="NormalWeb">
     <w:name w:val="Normal (Web)"/>
     <w:basedOn w:val="Normal"/>
+    <w:uiPriority w:val="99"/>
     <w:rsid w:val="00A940D4"/>
   </w:style>
 </w:styles>

</xml_diff>

<commit_message>
main finish twfe interpretation
</commit_message>
<xml_diff>
--- a/DiplomatervSablon_v3.2_hu.docx
+++ b/DiplomatervSablon_v3.2_hu.docx
@@ -5793,7 +5793,7 @@
         <w:rPr>
           <w:noProof/>
         </w:rPr>
-        <w:pict w14:anchorId="20EF568A">
+        <w:pict w14:anchorId="2EA4F86C">
           <v:shapetype id="_x0000_t75" coordsize="21600,21600" o:spt="75" o:preferrelative="t" path="m@4@5l@4@11@9@11@9@5xe" filled="f" stroked="f">
             <v:stroke joinstyle="miter"/>
             <v:formulas>
@@ -5813,7 +5813,7 @@
             <v:path o:extrusionok="f" gradientshapeok="t" o:connecttype="rect"/>
             <o:lock v:ext="edit" aspectratio="t"/>
           </v:shapetype>
-          <v:shape id="_x0000_i1025" type="#_x0000_t75" alt="" style="width:286pt;height:276pt;mso-width-percent:0;mso-height-percent:0;mso-width-percent:0;mso-height-percent:0">
+          <v:shape id="_x0000_i1025" type="#_x0000_t75" alt="" style="width:285.85pt;height:275.9pt;mso-width-percent:0;mso-height-percent:0;mso-width-percent:0;mso-height-percent:0">
             <v:imagedata r:id="rId12" r:href="rId13"/>
           </v:shape>
         </w:pict>
@@ -8185,7 +8185,7 @@
         <w:rPr>
           <w:noProof/>
         </w:rPr>
-        <w:t>13</w:t>
+        <w:t>12</w:t>
       </w:r>
       <w:r>
         <w:fldChar w:fldCharType="end"/>
@@ -8256,7 +8256,7 @@
         <w:rPr>
           <w:rStyle w:val="Strong"/>
         </w:rPr>
-        <w:t>(i) NYT-említések → mémvolumen</w:t>
+        <w:t>NYT-említések → mémvolumen</w:t>
       </w:r>
       <w:r>
         <w:rPr>
@@ -8280,7 +8280,13 @@
           <w:rStyle w:val="Strong"/>
         </w:rPr>
         <w:lastRenderedPageBreak/>
-        <w:t>(ii) mémvolumen → NYT-említések</w:t>
+        <w:t>M</w:t>
+      </w:r>
+      <w:r>
+        <w:rPr>
+          <w:rStyle w:val="Strong"/>
+        </w:rPr>
+        <w:t>émvolumen → NYT-említések</w:t>
       </w:r>
       <w:r>
         <w:t xml:space="preserve">: </w:t>
@@ -8297,7 +8303,7 @@
         <w:t>A Granger-eredmények és a CCF eredményeinek összevetése fontos következtetéshez vezet:</w:t>
       </w:r>
       <w:r>
-        <w:br/>
+        <w:t xml:space="preserve"> </w:t>
       </w:r>
       <w:r>
         <w:rPr>
@@ -8418,11 +8424,11 @@
     </w:p>
     <w:p>
       <w:r>
-        <w:t xml:space="preserve">A modell három fő kimeneti változóval dolgozik: a log1p transzformációval normalizált heti mémvolumennel, a mémek átlagos sentimentértékével, valamint a log1p </w:t>
+        <w:t xml:space="preserve">A modell három fő kimeneti változóval dolgozik: a log1p transzformációval normalizált heti mémvolumennel, a mémek átlagos sentimentértékével, valamint a log1p transzformált engagement-mutatóval. A fő magyarázóváltozókat az NYT-cikkek </w:t>
       </w:r>
       <w:r>
         <w:lastRenderedPageBreak/>
-        <w:t xml:space="preserve">transzformált engagement-mutatóval. A fő magyarázóváltozókat az NYT-cikkek jelenlétét jelző bináris indikátor és </w:t>
+        <w:t xml:space="preserve">jelenlétét jelző bináris indikátor és </w:t>
       </w:r>
       <w:r>
         <w:t>(</w:t>
@@ -8454,7 +8460,6 @@
     </w:p>
     <w:p>
       <w:r>
-        <w:lastRenderedPageBreak/>
         <w:t>A regressziós egyenlet a sentimentet tartalmazó teljes specifikáció esetén a következő alakban írható fel:</w:t>
       </w:r>
     </w:p>
@@ -8470,6 +8475,7 @@
             <w:rPr>
               <w:rFonts w:ascii="Cambria Math" w:hAnsi="Cambria Math"/>
             </w:rPr>
+            <w:lastRenderedPageBreak/>
             <m:t>Yb,t​=αb+δt​+k=0∑K​βk​NYT_mentionb,t-k​+k=0∑K​θk​nyt_sentimentb,t-k​+λreddit_activityb,t-1​</m:t>
           </m:r>
           <m:r>
@@ -8656,6 +8662,250 @@
     </w:p>
     <w:p>
       <w:pPr>
+        <w:rPr>
+          <w:lang w:val="en-HU"/>
+        </w:rPr>
+      </w:pPr>
+      <w:r>
+        <w:rPr>
+          <w:lang w:val="en-HU"/>
+        </w:rPr>
+        <w:t>A koefficiensek időbeli lefutását az 1</w:t>
+      </w:r>
+      <w:r>
+        <w:rPr>
+          <w:lang w:val="en-HU"/>
+        </w:rPr>
+        <w:t>3</w:t>
+      </w:r>
+      <w:r>
+        <w:rPr>
+          <w:lang w:val="en-HU"/>
+        </w:rPr>
+        <w:t xml:space="preserve">. és </w:t>
+      </w:r>
+      <w:r>
+        <w:rPr>
+          <w:lang w:val="en-HU"/>
+        </w:rPr>
+        <w:t>14</w:t>
+      </w:r>
+      <w:r>
+        <w:rPr>
+          <w:lang w:val="en-HU"/>
+        </w:rPr>
+        <w:t>. ábra szemlélteti, amelyek a mention-only specifikáció lagstruktúráját mutatják be az engagement és a volumen esetében.</w:t>
+      </w:r>
+    </w:p>
+    <w:p>
+      <w:r>
+        <w:t>A</w:t>
+      </w:r>
+      <w:r>
+        <w:t xml:space="preserve"> New York Times megjelenéseinek hatása mind a mémvolumenre, mind az engagementre összességében gyenge és nem szignifikáns. A mention-only specifikáció eredményei azt mutatják, hogy az azonnali hatás jellemzően negatív vagy zérus közeli, és az első két heti késleltetésnél tapasztalható mérsékelt pozitív elmozdulás sem tekinthető statisztikailag megbízhatónak a becsült hibasávok nagysága miatt. A későbbi késleltetések esetében a hatások ismét negatív irányba tolódnak, különösen a harmadik és negyedik héten, ahol a becsült koefficiensek rendre a legalacsonyabb értékeket veszik fel. Az időszerkezet így nem utal olyan dinamikára, amely a médiamegjelenések tartós vagy egyértelmű aktivitásnövelő hatását támasztaná alá, sem a mémek mennyiségét, sem az engagement intenzitását tekintve.</w:t>
+      </w:r>
+    </w:p>
+    <w:p>
+      <w:r>
+        <w:t>A sentiment bevonásával készült specifikációk eredményei e mintázatot lényegében változatlanul reprodukálják.</w:t>
+      </w:r>
+      <w:r>
+        <w:t xml:space="preserve"> (Függelék 5.6.)</w:t>
+      </w:r>
+      <w:r>
+        <w:t xml:space="preserve"> A kisebb és szelektált mintán becsült modellekben a koefficiensek nagyságrendje, iránya és időbeli lefutása szinte teljesen megegyezik a mention-only variánsokéval. A hírek érzelmi tónusa nem </w:t>
+      </w:r>
+      <w:r>
+        <w:lastRenderedPageBreak/>
+        <w:t>módosítja sem a megjelenések közvetlen, sem azok elnyújtott hatását, és nem jelenik meg olyan többletinformáció, amely a mémreakciók intenzívebb vagy tartósabb változását jelezné. A sentiment idősoros szerkezete sem hoz létre új dinamikát: a koefficioenspályák nem mutatnak egyedi mintázatot, és a kumulatív késleltetett hatások Wald-tesztjei nem jelzik összegzett szignifikancia fennállását</w:t>
+      </w:r>
+    </w:p>
+    <w:p>
+      <w:r>
+        <w:t>A két modellcsalád összevetése alapján megállapítható, hogy a médiamegjelenések ténye és a cikkek érzelmi tartalma egyaránt korlátozott befolyással bír a mémaktivitás alakulására. Az NYT-említésekhez tartozó koefficiensek alacsony nagyságrendje, a hibasávok kiterjedtsége és a negatív irányba visszahajló késleltetések azt jelzik, hogy a vizsgált márka-hetek szintjén a hírek nem indukálnak következetes aktivitásnövekedést. A sentiment további bevonása sem tár fel olyan összefüggést, amely arra utalna, hogy a pozitívabb vagy negatívabb tónusú médiaanyagok érdemben módosítanák a mémvolumen vagy az engagement mintázatát.</w:t>
+      </w:r>
+    </w:p>
+    <w:p>
+      <w:r>
+        <w:t>A teljes eredménystruktúra így egy stabil következtetést támogat: a New York Times márkaemlítései a vizsgált időhorizonton nem váltanak ki markáns, reprodukálható hatást a mémek mennyiségére és azok felhasználói interakcióira. A hatások iránya és ingadozása inkább azt sugallja, hogy a médiamegjelenések a márkák mémkörnyezetében csak korlátozott szerepet töltenek be, és dinamikájuk nem illeszkedik olyan mechanizmushoz, amely a hírek közvetlen vagy érzelmi tartalmon keresztüli amplifikáló hatását valószínűsítené.</w:t>
+      </w:r>
+    </w:p>
+    <w:p>
+      <w:pPr>
+        <w:keepNext/>
+        <w:ind w:firstLine="0"/>
+      </w:pPr>
+      <w:r>
+        <w:drawing>
+          <wp:inline distT="0" distB="0" distL="0" distR="0" wp14:anchorId="75AB5FD5" wp14:editId="5BFC8B68">
+            <wp:extent cx="3865829" cy="2577068"/>
+            <wp:effectExtent l="0" t="0" r="0" b="1270"/>
+            <wp:docPr id="755149054" name="Picture 30" descr="A graph with blue lines and numbers&#10;&#10;AI-generated content may be incorrect."/>
+            <wp:cNvGraphicFramePr>
+              <a:graphicFrameLocks xmlns:a="http://schemas.openxmlformats.org/drawingml/2006/main" noChangeAspect="1"/>
+            </wp:cNvGraphicFramePr>
+            <a:graphic xmlns:a="http://schemas.openxmlformats.org/drawingml/2006/main">
+              <a:graphicData uri="http://schemas.openxmlformats.org/drawingml/2006/picture">
+                <pic:pic xmlns:pic="http://schemas.openxmlformats.org/drawingml/2006/picture">
+                  <pic:nvPicPr>
+                    <pic:cNvPr id="755149054" name="Picture 30" descr="A graph with blue lines and numbers&#10;&#10;AI-generated content may be incorrect."/>
+                    <pic:cNvPicPr/>
+                  </pic:nvPicPr>
+                  <pic:blipFill>
+                    <a:blip r:embed="rId23" cstate="print">
+                      <a:extLst>
+                        <a:ext uri="{28A0092B-C50C-407E-A947-70E740481C1C}">
+                          <a14:useLocalDpi xmlns:a14="http://schemas.microsoft.com/office/drawing/2010/main" val="0"/>
+                        </a:ext>
+                      </a:extLst>
+                    </a:blip>
+                    <a:stretch>
+                      <a:fillRect/>
+                    </a:stretch>
+                  </pic:blipFill>
+                  <pic:spPr>
+                    <a:xfrm>
+                      <a:off x="0" y="0"/>
+                      <a:ext cx="3884520" cy="2589528"/>
+                    </a:xfrm>
+                    <a:prstGeom prst="rect">
+                      <a:avLst/>
+                    </a:prstGeom>
+                  </pic:spPr>
+                </pic:pic>
+              </a:graphicData>
+            </a:graphic>
+          </wp:inline>
+        </w:drawing>
+      </w:r>
+    </w:p>
+    <w:p>
+      <w:pPr>
+        <w:pStyle w:val="Caption"/>
+        <w:jc w:val="both"/>
+      </w:pPr>
+      <w:r>
+        <w:t xml:space="preserve">ábra </w:t>
+      </w:r>
+      <w:r>
+        <w:fldChar w:fldCharType="begin"/>
+      </w:r>
+      <w:r>
+        <w:instrText xml:space="preserve"> SEQ ábra \* ARABIC </w:instrText>
+      </w:r>
+      <w:r>
+        <w:fldChar w:fldCharType="separate"/>
+      </w:r>
+      <w:r>
+        <w:rPr>
+          <w:noProof/>
+        </w:rPr>
+        <w:t>13</w:t>
+      </w:r>
+      <w:r>
+        <w:fldChar w:fldCharType="end"/>
+      </w:r>
+      <w:r>
+        <w:t xml:space="preserve"> </w:t>
+      </w:r>
+      <w:r>
+        <w:t xml:space="preserve">Sentimentet nélkülöző </w:t>
+      </w:r>
+      <w:r>
+        <w:t>TWFE-specifikáció</w:t>
+      </w:r>
+      <w:r>
+        <w:t xml:space="preserve"> (log1p_meme_engagement)</w:t>
+      </w:r>
+    </w:p>
+    <w:p>
+      <w:pPr>
+        <w:keepNext/>
+        <w:ind w:firstLine="0"/>
+      </w:pPr>
+      <w:r>
+        <w:rPr>
+          <w:noProof/>
+        </w:rPr>
+        <w:lastRenderedPageBreak/>
+        <w:drawing>
+          <wp:inline distT="0" distB="0" distL="0" distR="0" wp14:anchorId="67146C40" wp14:editId="2EB47516">
+            <wp:extent cx="3865245" cy="2576678"/>
+            <wp:effectExtent l="0" t="0" r="0" b="1905"/>
+            <wp:docPr id="758821221" name="Picture 31" descr="A graph with blue lines and numbers&#10;&#10;AI-generated content may be incorrect."/>
+            <wp:cNvGraphicFramePr>
+              <a:graphicFrameLocks xmlns:a="http://schemas.openxmlformats.org/drawingml/2006/main" noChangeAspect="1"/>
+            </wp:cNvGraphicFramePr>
+            <a:graphic xmlns:a="http://schemas.openxmlformats.org/drawingml/2006/main">
+              <a:graphicData uri="http://schemas.openxmlformats.org/drawingml/2006/picture">
+                <pic:pic xmlns:pic="http://schemas.openxmlformats.org/drawingml/2006/picture">
+                  <pic:nvPicPr>
+                    <pic:cNvPr id="758821221" name="Picture 31" descr="A graph with blue lines and numbers&#10;&#10;AI-generated content may be incorrect."/>
+                    <pic:cNvPicPr/>
+                  </pic:nvPicPr>
+                  <pic:blipFill>
+                    <a:blip r:embed="rId24" cstate="print">
+                      <a:extLst>
+                        <a:ext uri="{28A0092B-C50C-407E-A947-70E740481C1C}">
+                          <a14:useLocalDpi xmlns:a14="http://schemas.microsoft.com/office/drawing/2010/main" val="0"/>
+                        </a:ext>
+                      </a:extLst>
+                    </a:blip>
+                    <a:stretch>
+                      <a:fillRect/>
+                    </a:stretch>
+                  </pic:blipFill>
+                  <pic:spPr>
+                    <a:xfrm>
+                      <a:off x="0" y="0"/>
+                      <a:ext cx="3889570" cy="2592894"/>
+                    </a:xfrm>
+                    <a:prstGeom prst="rect">
+                      <a:avLst/>
+                    </a:prstGeom>
+                  </pic:spPr>
+                </pic:pic>
+              </a:graphicData>
+            </a:graphic>
+          </wp:inline>
+        </w:drawing>
+      </w:r>
+    </w:p>
+    <w:p>
+      <w:pPr>
+        <w:pStyle w:val="Caption"/>
+        <w:jc w:val="both"/>
+      </w:pPr>
+      <w:r>
+        <w:t xml:space="preserve">ábra </w:t>
+      </w:r>
+      <w:r>
+        <w:fldChar w:fldCharType="begin"/>
+      </w:r>
+      <w:r>
+        <w:instrText xml:space="preserve"> SEQ ábra \* ARABIC </w:instrText>
+      </w:r>
+      <w:r>
+        <w:fldChar w:fldCharType="separate"/>
+      </w:r>
+      <w:r>
+        <w:rPr>
+          <w:noProof/>
+        </w:rPr>
+        <w:t>14</w:t>
+      </w:r>
+      <w:r>
+        <w:fldChar w:fldCharType="end"/>
+      </w:r>
+      <w:r>
+        <w:t xml:space="preserve"> </w:t>
+      </w:r>
+      <w:r>
+        <w:t>Sentimentet nélkülöző TWFE-specifikáció (log1p_meme_engagement)</w:t>
+      </w:r>
+    </w:p>
+    <w:p>
+      <w:pPr>
         <w:ind w:left="720" w:firstLine="0"/>
       </w:pPr>
     </w:p>
@@ -8920,7 +9170,7 @@
       <w:r>
         <w:t xml:space="preserve"> </w:t>
       </w:r>
-      <w:hyperlink r:id="rId23" w:history="1">
+      <w:hyperlink r:id="rId25" w:history="1">
         <w:r>
           <w:rPr>
             <w:rStyle w:val="Hyperlink"/>
@@ -8971,7 +9221,7 @@
       <w:r>
         <w:t xml:space="preserve">, </w:t>
       </w:r>
-      <w:hyperlink r:id="rId24" w:history="1">
+      <w:hyperlink r:id="rId26" w:history="1">
         <w:r>
           <w:rPr>
             <w:rStyle w:val="Hyperlink"/>
@@ -9049,7 +9299,7 @@
                     <pic:cNvPicPr/>
                   </pic:nvPicPr>
                   <pic:blipFill>
-                    <a:blip r:embed="rId25" cstate="print">
+                    <a:blip r:embed="rId27" cstate="print">
                       <a:extLst>
                         <a:ext uri="{28A0092B-C50C-407E-A947-70E740481C1C}">
                           <a14:useLocalDpi xmlns:a14="http://schemas.microsoft.com/office/drawing/2010/main" val="0"/>
@@ -9128,171 +9378,6 @@
                 <pic:pic xmlns:pic="http://schemas.openxmlformats.org/drawingml/2006/picture">
                   <pic:nvPicPr>
                     <pic:cNvPr id="1446051674" name="Picture 24" descr="A graph with red and blue lines&#10;&#10;AI-generated content may be incorrect."/>
-                    <pic:cNvPicPr/>
-                  </pic:nvPicPr>
-                  <pic:blipFill>
-                    <a:blip r:embed="rId26" cstate="print">
-                      <a:extLst>
-                        <a:ext uri="{28A0092B-C50C-407E-A947-70E740481C1C}">
-                          <a14:useLocalDpi xmlns:a14="http://schemas.microsoft.com/office/drawing/2010/main" val="0"/>
-                        </a:ext>
-                      </a:extLst>
-                    </a:blip>
-                    <a:stretch>
-                      <a:fillRect/>
-                    </a:stretch>
-                  </pic:blipFill>
-                  <pic:spPr>
-                    <a:xfrm>
-                      <a:off x="0" y="0"/>
-                      <a:ext cx="3600000" cy="1399953"/>
-                    </a:xfrm>
-                    <a:prstGeom prst="rect">
-                      <a:avLst/>
-                    </a:prstGeom>
-                  </pic:spPr>
-                </pic:pic>
-              </a:graphicData>
-            </a:graphic>
-          </wp:inline>
-        </w:drawing>
-      </w:r>
-    </w:p>
-    <w:p>
-      <w:pPr>
-        <w:pStyle w:val="Caption"/>
-      </w:pPr>
-      <w:r>
-        <w:t xml:space="preserve">Függelék ábra </w:t>
-      </w:r>
-      <w:r>
-        <w:fldChar w:fldCharType="begin"/>
-      </w:r>
-      <w:r>
-        <w:instrText xml:space="preserve"> SEQ Függelék_ábra \* ARABIC </w:instrText>
-      </w:r>
-      <w:r>
-        <w:fldChar w:fldCharType="separate"/>
-      </w:r>
-      <w:r>
-        <w:rPr>
-          <w:noProof/>
-        </w:rPr>
-        <w:t>2</w:t>
-      </w:r>
-      <w:r>
-        <w:fldChar w:fldCharType="end"/>
-      </w:r>
-      <w:r>
-        <w:t xml:space="preserve"> Apple mém-cikk idődiagram</w:t>
-      </w:r>
-    </w:p>
-    <w:p>
-      <w:pPr>
-        <w:keepNext/>
-        <w:ind w:firstLine="0"/>
-        <w:jc w:val="center"/>
-      </w:pPr>
-      <w:r>
-        <w:rPr>
-          <w:noProof/>
-        </w:rPr>
-        <w:drawing>
-          <wp:inline distT="0" distB="0" distL="0" distR="0" wp14:anchorId="547D6F6E" wp14:editId="6A5F2988">
-            <wp:extent cx="3600000" cy="1399953"/>
-            <wp:effectExtent l="0" t="0" r="0" b="0"/>
-            <wp:docPr id="1820479288" name="Picture 25" descr="A graph of a graph showing the difference between a line and a line&#10;&#10;AI-generated content may be incorrect."/>
-            <wp:cNvGraphicFramePr>
-              <a:graphicFrameLocks xmlns:a="http://schemas.openxmlformats.org/drawingml/2006/main" noChangeAspect="1"/>
-            </wp:cNvGraphicFramePr>
-            <a:graphic xmlns:a="http://schemas.openxmlformats.org/drawingml/2006/main">
-              <a:graphicData uri="http://schemas.openxmlformats.org/drawingml/2006/picture">
-                <pic:pic xmlns:pic="http://schemas.openxmlformats.org/drawingml/2006/picture">
-                  <pic:nvPicPr>
-                    <pic:cNvPr id="1820479288" name="Picture 25" descr="A graph of a graph showing the difference between a line and a line&#10;&#10;AI-generated content may be incorrect."/>
-                    <pic:cNvPicPr/>
-                  </pic:nvPicPr>
-                  <pic:blipFill>
-                    <a:blip r:embed="rId27" cstate="print">
-                      <a:extLst>
-                        <a:ext uri="{28A0092B-C50C-407E-A947-70E740481C1C}">
-                          <a14:useLocalDpi xmlns:a14="http://schemas.microsoft.com/office/drawing/2010/main" val="0"/>
-                        </a:ext>
-                      </a:extLst>
-                    </a:blip>
-                    <a:stretch>
-                      <a:fillRect/>
-                    </a:stretch>
-                  </pic:blipFill>
-                  <pic:spPr>
-                    <a:xfrm>
-                      <a:off x="0" y="0"/>
-                      <a:ext cx="3600000" cy="1399953"/>
-                    </a:xfrm>
-                    <a:prstGeom prst="rect">
-                      <a:avLst/>
-                    </a:prstGeom>
-                  </pic:spPr>
-                </pic:pic>
-              </a:graphicData>
-            </a:graphic>
-          </wp:inline>
-        </w:drawing>
-      </w:r>
-    </w:p>
-    <w:p>
-      <w:pPr>
-        <w:pStyle w:val="Caption"/>
-      </w:pPr>
-      <w:r>
-        <w:t xml:space="preserve">Függelék ábra </w:t>
-      </w:r>
-      <w:r>
-        <w:fldChar w:fldCharType="begin"/>
-      </w:r>
-      <w:r>
-        <w:instrText xml:space="preserve"> SEQ Függelék_ábra \* ARABIC </w:instrText>
-      </w:r>
-      <w:r>
-        <w:fldChar w:fldCharType="separate"/>
-      </w:r>
-      <w:r>
-        <w:rPr>
-          <w:noProof/>
-        </w:rPr>
-        <w:t>3</w:t>
-      </w:r>
-      <w:r>
-        <w:fldChar w:fldCharType="end"/>
-      </w:r>
-      <w:r>
-        <w:t xml:space="preserve"> Facebook mém-cikk idődiagram</w:t>
-      </w:r>
-    </w:p>
-    <w:p>
-      <w:pPr>
-        <w:keepNext/>
-        <w:ind w:firstLine="0"/>
-        <w:jc w:val="center"/>
-      </w:pPr>
-      <w:r>
-        <w:rPr>
-          <w:noProof/>
-        </w:rPr>
-        <w:lastRenderedPageBreak/>
-        <w:drawing>
-          <wp:inline distT="0" distB="0" distL="0" distR="0" wp14:anchorId="7E101F98" wp14:editId="5EB895FE">
-            <wp:extent cx="3600000" cy="1399953"/>
-            <wp:effectExtent l="0" t="0" r="0" b="0"/>
-            <wp:docPr id="1091383706" name="Picture 26" descr="A graph of a line graph&#10;&#10;AI-generated content may be incorrect."/>
-            <wp:cNvGraphicFramePr>
-              <a:graphicFrameLocks xmlns:a="http://schemas.openxmlformats.org/drawingml/2006/main" noChangeAspect="1"/>
-            </wp:cNvGraphicFramePr>
-            <a:graphic xmlns:a="http://schemas.openxmlformats.org/drawingml/2006/main">
-              <a:graphicData uri="http://schemas.openxmlformats.org/drawingml/2006/picture">
-                <pic:pic xmlns:pic="http://schemas.openxmlformats.org/drawingml/2006/picture">
-                  <pic:nvPicPr>
-                    <pic:cNvPr id="1091383706" name="Picture 26" descr="A graph of a line graph&#10;&#10;AI-generated content may be incorrect."/>
                     <pic:cNvPicPr/>
                   </pic:nvPicPr>
                   <pic:blipFill>
@@ -9343,13 +9428,13 @@
         <w:rPr>
           <w:noProof/>
         </w:rPr>
-        <w:t>4</w:t>
+        <w:t>2</w:t>
       </w:r>
       <w:r>
         <w:fldChar w:fldCharType="end"/>
       </w:r>
       <w:r>
-        <w:t xml:space="preserve"> Instagram mém-cikk idődiagram</w:t>
+        <w:t xml:space="preserve"> Apple mém-cikk idődiagram</w:t>
       </w:r>
     </w:p>
     <w:p>
@@ -9363,10 +9448,10 @@
           <w:noProof/>
         </w:rPr>
         <w:drawing>
-          <wp:inline distT="0" distB="0" distL="0" distR="0" wp14:anchorId="2F724E91" wp14:editId="456F6D15">
+          <wp:inline distT="0" distB="0" distL="0" distR="0" wp14:anchorId="547D6F6E" wp14:editId="6A5F2988">
             <wp:extent cx="3600000" cy="1399953"/>
             <wp:effectExtent l="0" t="0" r="0" b="0"/>
-            <wp:docPr id="328703387" name="Picture 27" descr="A graph of a graph showing the same value&#10;&#10;AI-generated content may be incorrect."/>
+            <wp:docPr id="1820479288" name="Picture 25" descr="A graph of a graph showing the difference between a line and a line&#10;&#10;AI-generated content may be incorrect."/>
             <wp:cNvGraphicFramePr>
               <a:graphicFrameLocks xmlns:a="http://schemas.openxmlformats.org/drawingml/2006/main" noChangeAspect="1"/>
             </wp:cNvGraphicFramePr>
@@ -9374,7 +9459,7 @@
               <a:graphicData uri="http://schemas.openxmlformats.org/drawingml/2006/picture">
                 <pic:pic xmlns:pic="http://schemas.openxmlformats.org/drawingml/2006/picture">
                   <pic:nvPicPr>
-                    <pic:cNvPr id="328703387" name="Picture 27" descr="A graph of a graph showing the same value&#10;&#10;AI-generated content may be incorrect."/>
+                    <pic:cNvPr id="1820479288" name="Picture 25" descr="A graph of a graph showing the difference between a line and a line&#10;&#10;AI-generated content may be incorrect."/>
                     <pic:cNvPicPr/>
                   </pic:nvPicPr>
                   <pic:blipFill>
@@ -9425,13 +9510,13 @@
         <w:rPr>
           <w:noProof/>
         </w:rPr>
-        <w:t>5</w:t>
+        <w:t>3</w:t>
       </w:r>
       <w:r>
         <w:fldChar w:fldCharType="end"/>
       </w:r>
       <w:r>
-        <w:t xml:space="preserve"> Microsoft mém-cikk idődiagram</w:t>
+        <w:t xml:space="preserve"> Facebook mém-cikk idődiagram</w:t>
       </w:r>
     </w:p>
     <w:p>
@@ -9444,11 +9529,12 @@
         <w:rPr>
           <w:noProof/>
         </w:rPr>
+        <w:lastRenderedPageBreak/>
         <w:drawing>
-          <wp:inline distT="0" distB="0" distL="0" distR="0" wp14:anchorId="01C0E21C" wp14:editId="1D64F749">
+          <wp:inline distT="0" distB="0" distL="0" distR="0" wp14:anchorId="7E101F98" wp14:editId="5EB895FE">
             <wp:extent cx="3600000" cy="1399953"/>
             <wp:effectExtent l="0" t="0" r="0" b="0"/>
-            <wp:docPr id="1583338737" name="Picture 28" descr="A graph showing a red and blue line&#10;&#10;AI-generated content may be incorrect."/>
+            <wp:docPr id="1091383706" name="Picture 26" descr="A graph of a line graph&#10;&#10;AI-generated content may be incorrect."/>
             <wp:cNvGraphicFramePr>
               <a:graphicFrameLocks xmlns:a="http://schemas.openxmlformats.org/drawingml/2006/main" noChangeAspect="1"/>
             </wp:cNvGraphicFramePr>
@@ -9456,7 +9542,7 @@
               <a:graphicData uri="http://schemas.openxmlformats.org/drawingml/2006/picture">
                 <pic:pic xmlns:pic="http://schemas.openxmlformats.org/drawingml/2006/picture">
                   <pic:nvPicPr>
-                    <pic:cNvPr id="1583338737" name="Picture 28" descr="A graph showing a red and blue line&#10;&#10;AI-generated content may be incorrect."/>
+                    <pic:cNvPr id="1091383706" name="Picture 26" descr="A graph of a line graph&#10;&#10;AI-generated content may be incorrect."/>
                     <pic:cNvPicPr/>
                   </pic:nvPicPr>
                   <pic:blipFill>
@@ -9507,13 +9593,13 @@
         <w:rPr>
           <w:noProof/>
         </w:rPr>
-        <w:t>6</w:t>
+        <w:t>4</w:t>
       </w:r>
       <w:r>
         <w:fldChar w:fldCharType="end"/>
       </w:r>
       <w:r>
-        <w:t xml:space="preserve"> Netflix mém-cikk idődiagram</w:t>
+        <w:t xml:space="preserve"> Instagram mém-cikk idődiagram</w:t>
       </w:r>
     </w:p>
     <w:p>
@@ -9527,10 +9613,10 @@
           <w:noProof/>
         </w:rPr>
         <w:drawing>
-          <wp:inline distT="0" distB="0" distL="0" distR="0" wp14:anchorId="06C569D9" wp14:editId="1EB83F66">
+          <wp:inline distT="0" distB="0" distL="0" distR="0" wp14:anchorId="2F724E91" wp14:editId="456F6D15">
             <wp:extent cx="3600000" cy="1399953"/>
             <wp:effectExtent l="0" t="0" r="0" b="0"/>
-            <wp:docPr id="189274540" name="Picture 29" descr="A graph with red and blue lines&#10;&#10;AI-generated content may be incorrect."/>
+            <wp:docPr id="328703387" name="Picture 27" descr="A graph of a graph showing the same value&#10;&#10;AI-generated content may be incorrect."/>
             <wp:cNvGraphicFramePr>
               <a:graphicFrameLocks xmlns:a="http://schemas.openxmlformats.org/drawingml/2006/main" noChangeAspect="1"/>
             </wp:cNvGraphicFramePr>
@@ -9538,7 +9624,7 @@
               <a:graphicData uri="http://schemas.openxmlformats.org/drawingml/2006/picture">
                 <pic:pic xmlns:pic="http://schemas.openxmlformats.org/drawingml/2006/picture">
                   <pic:nvPicPr>
-                    <pic:cNvPr id="189274540" name="Picture 29" descr="A graph with red and blue lines&#10;&#10;AI-generated content may be incorrect."/>
+                    <pic:cNvPr id="328703387" name="Picture 27" descr="A graph of a graph showing the same value&#10;&#10;AI-generated content may be incorrect."/>
                     <pic:cNvPicPr/>
                   </pic:nvPicPr>
                   <pic:blipFill>
@@ -9589,13 +9675,13 @@
         <w:rPr>
           <w:noProof/>
         </w:rPr>
-        <w:t>7</w:t>
+        <w:t>5</w:t>
       </w:r>
       <w:r>
         <w:fldChar w:fldCharType="end"/>
       </w:r>
       <w:r>
-        <w:t xml:space="preserve"> Spotify mém-cikk idődiagram</w:t>
+        <w:t xml:space="preserve"> Microsoft mém-cikk idődiagram</w:t>
       </w:r>
     </w:p>
     <w:p>
@@ -9608,12 +9694,11 @@
         <w:rPr>
           <w:noProof/>
         </w:rPr>
-        <w:lastRenderedPageBreak/>
         <w:drawing>
-          <wp:inline distT="0" distB="0" distL="0" distR="0" wp14:anchorId="66BE5E74" wp14:editId="494CB493">
+          <wp:inline distT="0" distB="0" distL="0" distR="0" wp14:anchorId="01C0E21C" wp14:editId="1D64F749">
             <wp:extent cx="3600000" cy="1399953"/>
             <wp:effectExtent l="0" t="0" r="0" b="0"/>
-            <wp:docPr id="456254425" name="Picture 30" descr="A graph with blue and red lines&#10;&#10;AI-generated content may be incorrect."/>
+            <wp:docPr id="1583338737" name="Picture 28" descr="A graph showing a red and blue line&#10;&#10;AI-generated content may be incorrect."/>
             <wp:cNvGraphicFramePr>
               <a:graphicFrameLocks xmlns:a="http://schemas.openxmlformats.org/drawingml/2006/main" noChangeAspect="1"/>
             </wp:cNvGraphicFramePr>
@@ -9621,7 +9706,7 @@
               <a:graphicData uri="http://schemas.openxmlformats.org/drawingml/2006/picture">
                 <pic:pic xmlns:pic="http://schemas.openxmlformats.org/drawingml/2006/picture">
                   <pic:nvPicPr>
-                    <pic:cNvPr id="456254425" name="Picture 30" descr="A graph with blue and red lines&#10;&#10;AI-generated content may be incorrect."/>
+                    <pic:cNvPr id="1583338737" name="Picture 28" descr="A graph showing a red and blue line&#10;&#10;AI-generated content may be incorrect."/>
                     <pic:cNvPicPr/>
                   </pic:nvPicPr>
                   <pic:blipFill>
@@ -9672,13 +9757,13 @@
         <w:rPr>
           <w:noProof/>
         </w:rPr>
-        <w:t>8</w:t>
+        <w:t>6</w:t>
       </w:r>
       <w:r>
         <w:fldChar w:fldCharType="end"/>
       </w:r>
       <w:r>
-        <w:t xml:space="preserve"> Tesla mém-cikk idődiagram</w:t>
+        <w:t xml:space="preserve"> Netflix mém-cikk idődiagram</w:t>
       </w:r>
     </w:p>
     <w:p>
@@ -9692,10 +9777,10 @@
           <w:noProof/>
         </w:rPr>
         <w:drawing>
-          <wp:inline distT="0" distB="0" distL="0" distR="0" wp14:anchorId="70C46339" wp14:editId="5840CEDC">
+          <wp:inline distT="0" distB="0" distL="0" distR="0" wp14:anchorId="06C569D9" wp14:editId="1EB83F66">
             <wp:extent cx="3600000" cy="1399953"/>
             <wp:effectExtent l="0" t="0" r="0" b="0"/>
-            <wp:docPr id="708702957" name="Picture 31" descr="A graph of a graph of a graph&#10;&#10;AI-generated content may be incorrect."/>
+            <wp:docPr id="189274540" name="Picture 29" descr="A graph with red and blue lines&#10;&#10;AI-generated content may be incorrect."/>
             <wp:cNvGraphicFramePr>
               <a:graphicFrameLocks xmlns:a="http://schemas.openxmlformats.org/drawingml/2006/main" noChangeAspect="1"/>
             </wp:cNvGraphicFramePr>
@@ -9703,7 +9788,7 @@
               <a:graphicData uri="http://schemas.openxmlformats.org/drawingml/2006/picture">
                 <pic:pic xmlns:pic="http://schemas.openxmlformats.org/drawingml/2006/picture">
                   <pic:nvPicPr>
-                    <pic:cNvPr id="708702957" name="Picture 31" descr="A graph of a graph of a graph&#10;&#10;AI-generated content may be incorrect."/>
+                    <pic:cNvPr id="189274540" name="Picture 29" descr="A graph with red and blue lines&#10;&#10;AI-generated content may be incorrect."/>
                     <pic:cNvPicPr/>
                   </pic:nvPicPr>
                   <pic:blipFill>
@@ -9754,6 +9839,171 @@
         <w:rPr>
           <w:noProof/>
         </w:rPr>
+        <w:t>7</w:t>
+      </w:r>
+      <w:r>
+        <w:fldChar w:fldCharType="end"/>
+      </w:r>
+      <w:r>
+        <w:t xml:space="preserve"> Spotify mém-cikk idődiagram</w:t>
+      </w:r>
+    </w:p>
+    <w:p>
+      <w:pPr>
+        <w:keepNext/>
+        <w:ind w:firstLine="0"/>
+        <w:jc w:val="center"/>
+      </w:pPr>
+      <w:r>
+        <w:rPr>
+          <w:noProof/>
+        </w:rPr>
+        <w:lastRenderedPageBreak/>
+        <w:drawing>
+          <wp:inline distT="0" distB="0" distL="0" distR="0" wp14:anchorId="66BE5E74" wp14:editId="494CB493">
+            <wp:extent cx="3600000" cy="1399953"/>
+            <wp:effectExtent l="0" t="0" r="0" b="0"/>
+            <wp:docPr id="456254425" name="Picture 30" descr="A graph with blue and red lines&#10;&#10;AI-generated content may be incorrect."/>
+            <wp:cNvGraphicFramePr>
+              <a:graphicFrameLocks xmlns:a="http://schemas.openxmlformats.org/drawingml/2006/main" noChangeAspect="1"/>
+            </wp:cNvGraphicFramePr>
+            <a:graphic xmlns:a="http://schemas.openxmlformats.org/drawingml/2006/main">
+              <a:graphicData uri="http://schemas.openxmlformats.org/drawingml/2006/picture">
+                <pic:pic xmlns:pic="http://schemas.openxmlformats.org/drawingml/2006/picture">
+                  <pic:nvPicPr>
+                    <pic:cNvPr id="456254425" name="Picture 30" descr="A graph with blue and red lines&#10;&#10;AI-generated content may be incorrect."/>
+                    <pic:cNvPicPr/>
+                  </pic:nvPicPr>
+                  <pic:blipFill>
+                    <a:blip r:embed="rId34" cstate="print">
+                      <a:extLst>
+                        <a:ext uri="{28A0092B-C50C-407E-A947-70E740481C1C}">
+                          <a14:useLocalDpi xmlns:a14="http://schemas.microsoft.com/office/drawing/2010/main" val="0"/>
+                        </a:ext>
+                      </a:extLst>
+                    </a:blip>
+                    <a:stretch>
+                      <a:fillRect/>
+                    </a:stretch>
+                  </pic:blipFill>
+                  <pic:spPr>
+                    <a:xfrm>
+                      <a:off x="0" y="0"/>
+                      <a:ext cx="3600000" cy="1399953"/>
+                    </a:xfrm>
+                    <a:prstGeom prst="rect">
+                      <a:avLst/>
+                    </a:prstGeom>
+                  </pic:spPr>
+                </pic:pic>
+              </a:graphicData>
+            </a:graphic>
+          </wp:inline>
+        </w:drawing>
+      </w:r>
+    </w:p>
+    <w:p>
+      <w:pPr>
+        <w:pStyle w:val="Caption"/>
+      </w:pPr>
+      <w:r>
+        <w:t xml:space="preserve">Függelék ábra </w:t>
+      </w:r>
+      <w:r>
+        <w:fldChar w:fldCharType="begin"/>
+      </w:r>
+      <w:r>
+        <w:instrText xml:space="preserve"> SEQ Függelék_ábra \* ARABIC </w:instrText>
+      </w:r>
+      <w:r>
+        <w:fldChar w:fldCharType="separate"/>
+      </w:r>
+      <w:r>
+        <w:rPr>
+          <w:noProof/>
+        </w:rPr>
+        <w:t>8</w:t>
+      </w:r>
+      <w:r>
+        <w:fldChar w:fldCharType="end"/>
+      </w:r>
+      <w:r>
+        <w:t xml:space="preserve"> Tesla mém-cikk idődiagram</w:t>
+      </w:r>
+    </w:p>
+    <w:p>
+      <w:pPr>
+        <w:keepNext/>
+        <w:ind w:firstLine="0"/>
+        <w:jc w:val="center"/>
+      </w:pPr>
+      <w:r>
+        <w:rPr>
+          <w:noProof/>
+        </w:rPr>
+        <w:drawing>
+          <wp:inline distT="0" distB="0" distL="0" distR="0" wp14:anchorId="70C46339" wp14:editId="5840CEDC">
+            <wp:extent cx="3600000" cy="1399953"/>
+            <wp:effectExtent l="0" t="0" r="0" b="0"/>
+            <wp:docPr id="708702957" name="Picture 31" descr="A graph of a graph of a graph&#10;&#10;AI-generated content may be incorrect."/>
+            <wp:cNvGraphicFramePr>
+              <a:graphicFrameLocks xmlns:a="http://schemas.openxmlformats.org/drawingml/2006/main" noChangeAspect="1"/>
+            </wp:cNvGraphicFramePr>
+            <a:graphic xmlns:a="http://schemas.openxmlformats.org/drawingml/2006/main">
+              <a:graphicData uri="http://schemas.openxmlformats.org/drawingml/2006/picture">
+                <pic:pic xmlns:pic="http://schemas.openxmlformats.org/drawingml/2006/picture">
+                  <pic:nvPicPr>
+                    <pic:cNvPr id="708702957" name="Picture 31" descr="A graph of a graph of a graph&#10;&#10;AI-generated content may be incorrect."/>
+                    <pic:cNvPicPr/>
+                  </pic:nvPicPr>
+                  <pic:blipFill>
+                    <a:blip r:embed="rId35" cstate="print">
+                      <a:extLst>
+                        <a:ext uri="{28A0092B-C50C-407E-A947-70E740481C1C}">
+                          <a14:useLocalDpi xmlns:a14="http://schemas.microsoft.com/office/drawing/2010/main" val="0"/>
+                        </a:ext>
+                      </a:extLst>
+                    </a:blip>
+                    <a:stretch>
+                      <a:fillRect/>
+                    </a:stretch>
+                  </pic:blipFill>
+                  <pic:spPr>
+                    <a:xfrm>
+                      <a:off x="0" y="0"/>
+                      <a:ext cx="3600000" cy="1399953"/>
+                    </a:xfrm>
+                    <a:prstGeom prst="rect">
+                      <a:avLst/>
+                    </a:prstGeom>
+                  </pic:spPr>
+                </pic:pic>
+              </a:graphicData>
+            </a:graphic>
+          </wp:inline>
+        </w:drawing>
+      </w:r>
+    </w:p>
+    <w:p>
+      <w:pPr>
+        <w:pStyle w:val="Caption"/>
+      </w:pPr>
+      <w:r>
+        <w:t xml:space="preserve">Függelék ábra </w:t>
+      </w:r>
+      <w:r>
+        <w:fldChar w:fldCharType="begin"/>
+      </w:r>
+      <w:r>
+        <w:instrText xml:space="preserve"> SEQ Függelék_ábra \* ARABIC </w:instrText>
+      </w:r>
+      <w:r>
+        <w:fldChar w:fldCharType="separate"/>
+      </w:r>
+      <w:r>
+        <w:rPr>
+          <w:noProof/>
+        </w:rPr>
         <w:t>9</w:t>
       </w:r>
       <w:r>
@@ -9796,7 +10046,7 @@
                     <pic:cNvPicPr/>
                   </pic:nvPicPr>
                   <pic:blipFill>
-                    <a:blip r:embed="rId34"/>
+                    <a:blip r:embed="rId36"/>
                     <a:stretch>
                       <a:fillRect/>
                     </a:stretch>
@@ -9874,7 +10124,7 @@
                     <pic:cNvPicPr/>
                   </pic:nvPicPr>
                   <pic:blipFill>
-                    <a:blip r:embed="rId35"/>
+                    <a:blip r:embed="rId37"/>
                     <a:stretch>
                       <a:fillRect/>
                     </a:stretch>
@@ -10050,7 +10300,7 @@
                     <pic:cNvPicPr/>
                   </pic:nvPicPr>
                   <pic:blipFill>
-                    <a:blip r:embed="rId36">
+                    <a:blip r:embed="rId38">
                       <a:extLst>
                         <a:ext uri="{28A0092B-C50C-407E-A947-70E740481C1C}">
                           <a14:useLocalDpi xmlns:a14="http://schemas.microsoft.com/office/drawing/2010/main" val="0"/>
@@ -10152,7 +10402,7 @@
                     <pic:cNvPicPr/>
                   </pic:nvPicPr>
                   <pic:blipFill>
-                    <a:blip r:embed="rId37">
+                    <a:blip r:embed="rId39">
                       <a:extLst>
                         <a:ext uri="{28A0092B-C50C-407E-A947-70E740481C1C}">
                           <a14:useLocalDpi xmlns:a14="http://schemas.microsoft.com/office/drawing/2010/main" val="0"/>
@@ -10244,7 +10494,7 @@
                     <pic:cNvPicPr/>
                   </pic:nvPicPr>
                   <pic:blipFill>
-                    <a:blip r:embed="rId38">
+                    <a:blip r:embed="rId40">
                       <a:extLst>
                         <a:ext uri="{28A0092B-C50C-407E-A947-70E740481C1C}">
                           <a14:useLocalDpi xmlns:a14="http://schemas.microsoft.com/office/drawing/2010/main" val="0"/>
@@ -10312,7 +10562,10 @@
         </w:rPr>
       </w:pPr>
       <w:r>
-        <w:t>A 13. és 14. ábra az eseményablakok átfedését kizáró alternatív specifikáció eredményeit mutatja.</w:t>
+        <w:t>Az</w:t>
+      </w:r>
+      <w:r>
+        <w:t xml:space="preserve"> eseményablakok átfedését kizáró alternatív specifikáció eredményeit mutatja.</w:t>
       </w:r>
       <w:r>
         <w:t xml:space="preserve"> </w:t>
@@ -10368,7 +10621,7 @@
                     <pic:cNvPicPr/>
                   </pic:nvPicPr>
                   <pic:blipFill>
-                    <a:blip r:embed="rId39">
+                    <a:blip r:embed="rId41">
                       <a:extLst>
                         <a:ext uri="{28A0092B-C50C-407E-A947-70E740481C1C}">
                           <a14:useLocalDpi xmlns:a14="http://schemas.microsoft.com/office/drawing/2010/main" val="0"/>
@@ -10454,7 +10707,7 @@
                     <pic:cNvPicPr/>
                   </pic:nvPicPr>
                   <pic:blipFill>
-                    <a:blip r:embed="rId40">
+                    <a:blip r:embed="rId42">
                       <a:extLst>
                         <a:ext uri="{28A0092B-C50C-407E-A947-70E740481C1C}">
                           <a14:useLocalDpi xmlns:a14="http://schemas.microsoft.com/office/drawing/2010/main" val="0"/>
@@ -10572,7 +10825,7 @@
                     <pic:cNvPicPr/>
                   </pic:nvPicPr>
                   <pic:blipFill>
-                    <a:blip r:embed="rId41">
+                    <a:blip r:embed="rId43">
                       <a:extLst>
                         <a:ext uri="{28A0092B-C50C-407E-A947-70E740481C1C}">
                           <a14:useLocalDpi xmlns:a14="http://schemas.microsoft.com/office/drawing/2010/main" val="0"/>
@@ -10659,7 +10912,7 @@
                     <pic:cNvPicPr/>
                   </pic:nvPicPr>
                   <pic:blipFill>
-                    <a:blip r:embed="rId42">
+                    <a:blip r:embed="rId44">
                       <a:extLst>
                         <a:ext uri="{28A0092B-C50C-407E-A947-70E740481C1C}">
                           <a14:useLocalDpi xmlns:a14="http://schemas.microsoft.com/office/drawing/2010/main" val="0"/>
@@ -10766,7 +11019,7 @@
                     <pic:cNvPicPr/>
                   </pic:nvPicPr>
                   <pic:blipFill>
-                    <a:blip r:embed="rId43">
+                    <a:blip r:embed="rId45">
                       <a:extLst>
                         <a:ext uri="{28A0092B-C50C-407E-A947-70E740481C1C}">
                           <a14:useLocalDpi xmlns:a14="http://schemas.microsoft.com/office/drawing/2010/main" val="0"/>
@@ -10853,7 +11106,7 @@
                     <pic:cNvPicPr/>
                   </pic:nvPicPr>
                   <pic:blipFill>
-                    <a:blip r:embed="rId44">
+                    <a:blip r:embed="rId46">
                       <a:extLst>
                         <a:ext uri="{28A0092B-C50C-407E-A947-70E740481C1C}">
                           <a14:useLocalDpi xmlns:a14="http://schemas.microsoft.com/office/drawing/2010/main" val="0"/>
@@ -10967,7 +11220,7 @@
                     <pic:cNvPicPr/>
                   </pic:nvPicPr>
                   <pic:blipFill>
-                    <a:blip r:embed="rId45">
+                    <a:blip r:embed="rId47">
                       <a:extLst>
                         <a:ext uri="{28A0092B-C50C-407E-A947-70E740481C1C}">
                           <a14:useLocalDpi xmlns:a14="http://schemas.microsoft.com/office/drawing/2010/main" val="0"/>
@@ -11047,9 +11300,230 @@
         <w:t>A mintázatok megmaradnak, ami arra utal, hogy az eredmények nem globális trendek következményei, hanem vállalatspecifikus hírtónusváltozások következményei.</w:t>
       </w:r>
     </w:p>
+    <w:p>
+      <w:pPr>
+        <w:pStyle w:val="Heading2"/>
+      </w:pPr>
+      <w:r>
+        <w:lastRenderedPageBreak/>
+        <w:t>5.</w:t>
+      </w:r>
+      <w:r>
+        <w:t>6</w:t>
+      </w:r>
+      <w:r>
+        <w:t xml:space="preserve">. Diagnosztikai elemzések </w:t>
+      </w:r>
+    </w:p>
+    <w:p>
+      <w:pPr>
+        <w:keepNext/>
+      </w:pPr>
+      <w:r>
+        <w:rPr>
+          <w:noProof/>
+        </w:rPr>
+        <w:drawing>
+          <wp:inline distT="0" distB="0" distL="0" distR="0" wp14:anchorId="749AB558" wp14:editId="50884440">
+            <wp:extent cx="3938489" cy="2625505"/>
+            <wp:effectExtent l="0" t="0" r="0" b="3810"/>
+            <wp:docPr id="44515323" name="Picture 34" descr="A graph with blue lines and white text&#10;&#10;AI-generated content may be incorrect."/>
+            <wp:cNvGraphicFramePr>
+              <a:graphicFrameLocks xmlns:a="http://schemas.openxmlformats.org/drawingml/2006/main" noChangeAspect="1"/>
+            </wp:cNvGraphicFramePr>
+            <a:graphic xmlns:a="http://schemas.openxmlformats.org/drawingml/2006/main">
+              <a:graphicData uri="http://schemas.openxmlformats.org/drawingml/2006/picture">
+                <pic:pic xmlns:pic="http://schemas.openxmlformats.org/drawingml/2006/picture">
+                  <pic:nvPicPr>
+                    <pic:cNvPr id="44515323" name="Picture 34" descr="A graph with blue lines and white text&#10;&#10;AI-generated content may be incorrect."/>
+                    <pic:cNvPicPr/>
+                  </pic:nvPicPr>
+                  <pic:blipFill>
+                    <a:blip r:embed="rId48" cstate="print">
+                      <a:extLst>
+                        <a:ext uri="{28A0092B-C50C-407E-A947-70E740481C1C}">
+                          <a14:useLocalDpi xmlns:a14="http://schemas.microsoft.com/office/drawing/2010/main" val="0"/>
+                        </a:ext>
+                      </a:extLst>
+                    </a:blip>
+                    <a:stretch>
+                      <a:fillRect/>
+                    </a:stretch>
+                  </pic:blipFill>
+                  <pic:spPr>
+                    <a:xfrm>
+                      <a:off x="0" y="0"/>
+                      <a:ext cx="3973360" cy="2648751"/>
+                    </a:xfrm>
+                    <a:prstGeom prst="rect">
+                      <a:avLst/>
+                    </a:prstGeom>
+                  </pic:spPr>
+                </pic:pic>
+              </a:graphicData>
+            </a:graphic>
+          </wp:inline>
+        </w:drawing>
+      </w:r>
+    </w:p>
+    <w:p>
+      <w:pPr>
+        <w:pStyle w:val="Caption"/>
+        <w:jc w:val="both"/>
+      </w:pPr>
+      <w:r>
+        <w:t xml:space="preserve">Függelék ábra </w:t>
+      </w:r>
+      <w:r>
+        <w:fldChar w:fldCharType="begin"/>
+      </w:r>
+      <w:r>
+        <w:instrText xml:space="preserve"> SEQ Függelék_ábra \* ARABIC </w:instrText>
+      </w:r>
+      <w:r>
+        <w:fldChar w:fldCharType="separate"/>
+      </w:r>
+      <w:r>
+        <w:rPr>
+          <w:noProof/>
+        </w:rPr>
+        <w:t>22</w:t>
+      </w:r>
+      <w:r>
+        <w:fldChar w:fldCharType="end"/>
+      </w:r>
+      <w:r>
+        <w:t xml:space="preserve"> S</w:t>
+      </w:r>
+      <w:r>
+        <w:t>entimentet is tartalmazó TWFE-specifikáci</w:t>
+      </w:r>
+      <w:r>
+        <w:t>ó (</w:t>
+      </w:r>
+      <w:r>
+        <w:t>log1p_meme_engagement</w:t>
+      </w:r>
+      <w:r>
+        <w:t xml:space="preserve">) </w:t>
+      </w:r>
+    </w:p>
+    <w:p>
+      <w:pPr>
+        <w:pStyle w:val="NormalWeb"/>
+        <w:keepNext/>
+      </w:pPr>
+      <w:r>
+        <w:rPr>
+          <w:noProof/>
+        </w:rPr>
+        <w:drawing>
+          <wp:inline distT="0" distB="0" distL="0" distR="0" wp14:anchorId="24274C08" wp14:editId="1C9D1055">
+            <wp:extent cx="4019975" cy="2679826"/>
+            <wp:effectExtent l="0" t="0" r="6350" b="0"/>
+            <wp:docPr id="201612167" name="Picture 35" descr="A graph with blue lines and numbers&#10;&#10;AI-generated content may be incorrect."/>
+            <wp:cNvGraphicFramePr>
+              <a:graphicFrameLocks xmlns:a="http://schemas.openxmlformats.org/drawingml/2006/main" noChangeAspect="1"/>
+            </wp:cNvGraphicFramePr>
+            <a:graphic xmlns:a="http://schemas.openxmlformats.org/drawingml/2006/main">
+              <a:graphicData uri="http://schemas.openxmlformats.org/drawingml/2006/picture">
+                <pic:pic xmlns:pic="http://schemas.openxmlformats.org/drawingml/2006/picture">
+                  <pic:nvPicPr>
+                    <pic:cNvPr id="201612167" name="Picture 35" descr="A graph with blue lines and numbers&#10;&#10;AI-generated content may be incorrect."/>
+                    <pic:cNvPicPr/>
+                  </pic:nvPicPr>
+                  <pic:blipFill>
+                    <a:blip r:embed="rId49" cstate="print">
+                      <a:extLst>
+                        <a:ext uri="{28A0092B-C50C-407E-A947-70E740481C1C}">
+                          <a14:useLocalDpi xmlns:a14="http://schemas.microsoft.com/office/drawing/2010/main" val="0"/>
+                        </a:ext>
+                      </a:extLst>
+                    </a:blip>
+                    <a:stretch>
+                      <a:fillRect/>
+                    </a:stretch>
+                  </pic:blipFill>
+                  <pic:spPr>
+                    <a:xfrm>
+                      <a:off x="0" y="0"/>
+                      <a:ext cx="4045137" cy="2696599"/>
+                    </a:xfrm>
+                    <a:prstGeom prst="rect">
+                      <a:avLst/>
+                    </a:prstGeom>
+                  </pic:spPr>
+                </pic:pic>
+              </a:graphicData>
+            </a:graphic>
+          </wp:inline>
+        </w:drawing>
+      </w:r>
+    </w:p>
+    <w:p>
+      <w:pPr>
+        <w:pStyle w:val="Caption"/>
+        <w:jc w:val="both"/>
+      </w:pPr>
+      <w:r>
+        <w:t xml:space="preserve">Függelék ábra </w:t>
+      </w:r>
+      <w:r>
+        <w:fldChar w:fldCharType="begin"/>
+      </w:r>
+      <w:r>
+        <w:instrText xml:space="preserve"> SEQ Függelék_ábra \* ARABIC </w:instrText>
+      </w:r>
+      <w:r>
+        <w:fldChar w:fldCharType="separate"/>
+      </w:r>
+      <w:r>
+        <w:rPr>
+          <w:noProof/>
+        </w:rPr>
+        <w:t>23</w:t>
+      </w:r>
+      <w:r>
+        <w:fldChar w:fldCharType="end"/>
+      </w:r>
+      <w:r>
+        <w:t xml:space="preserve"> </w:t>
+      </w:r>
+      <w:r>
+        <w:t>Sentimentet is tartalmazó TWFE-specifikáció (</w:t>
+      </w:r>
+      <w:r>
+        <w:rPr>
+          <w:lang w:val="en-HU"/>
+        </w:rPr>
+        <w:t>log1p_meme_volume</w:t>
+      </w:r>
+      <w:r>
+        <w:t>)</w:t>
+      </w:r>
+    </w:p>
+    <w:p>
+      <w:pPr>
+        <w:pStyle w:val="NormalWeb"/>
+      </w:pPr>
+      <w:r>
+        <w:t xml:space="preserve">Az </w:t>
+      </w:r>
+      <w:r>
+        <w:t>22-es és 23-as ábra</w:t>
+      </w:r>
+      <w:r>
+        <w:t xml:space="preserve"> a főszövegben bemutatott mention-only eredmények robusztusságát vizsgálja az érzelmi tónus kontrollálása mellett.</w:t>
+      </w:r>
+    </w:p>
+    <w:p>
+      <w:pPr>
+        <w:pStyle w:val="NormalWeb"/>
+      </w:pPr>
+    </w:p>
     <w:sectPr>
-      <w:headerReference w:type="even" r:id="rId46"/>
-      <w:footerReference w:type="default" r:id="rId47"/>
+      <w:headerReference w:type="even" r:id="rId50"/>
+      <w:footerReference w:type="default" r:id="rId51"/>
       <w:type w:val="continuous"/>
       <w:pgSz w:w="11907" w:h="16840" w:code="9"/>
       <w:pgMar w:top="1418" w:right="1418" w:bottom="1418" w:left="1418" w:header="709" w:footer="709" w:gutter="567"/>

</xml_diff>

<commit_message>
main add meme sentiment mention to summary
</commit_message>
<xml_diff>
--- a/DiplomatervSablon_v3.2_hu.docx
+++ b/DiplomatervSablon_v3.2_hu.docx
@@ -5619,7 +5619,7 @@
         <w:rPr>
           <w:noProof/>
         </w:rPr>
-        <w:pict w14:anchorId="22BE9106">
+        <w:pict w14:anchorId="79F4274D">
           <v:shapetype id="_x0000_t75" coordsize="21600,21600" o:spt="75" o:preferrelative="t" path="m@4@5l@4@11@9@11@9@5xe" filled="f" stroked="f">
             <v:stroke joinstyle="miter"/>
             <v:formulas>
@@ -8725,7 +8725,7 @@
         <w:rPr>
           <w:lang w:val="en-HU" w:eastAsia="en-GB"/>
         </w:rPr>
-        <w:t>A kutatás célja az volt, hogy marketing- és kommunikációs szempontból feltárja, miként jelennek meg a vezető globális márkák az online mémkultúrában, és milyen mintázatok figyelhetők meg a mémek mennyiségi és érzelmi alakulásában. A vizsgálat alapját egy összetett multimodális pipeline adta, amely képfelismerés, OCR és szentimentelemzés kombinációjával azonosította a márkákhoz köthető mémeket, majd ezek aktivitási mutatóit (mémvolumen, engagement) összevetette a New York Times médiamegjelenéseivel és hírsentimentjével. A felépített adatbázis lehetővé tette, hogy a mémek időbeli viselkedését, érzelmi jellemzőit és a hírekkel való kapcsolatát panel regressziós, eseményvizsgálati és idősoros módszerekkel értékeljük.</w:t>
+        <w:t>A kutatás célja az volt, hogy marketing- és kommunikációs szempontból feltárja, miként jelennek meg a vezető globális márkák az online mémkultúrában, és milyen mintázatok figyelhetők meg a mémek mennyiségi és érzelmi alakulásában. A vizsgálathoz olyan összetett adathalmazt állítottam elő, amely scrapinggel gyűjtött mémeket, képosztályozó modellek segítségével felismert logókat, OCR-rel detektált márkaneveket, valamint egy egyetemi együttműködésből származó logóadatokat egyesített. Ezek alapján meghatározhatóvá váltak a márkákhoz köthető mémek aktivitási mutatói (mémvolumen, engagement), amelyeket a New York Times médiamegjelenéseivel és hírsentimentjével vetettem össze. A létrehozott adatkészlet lehetővé tette, hogy a mémek időbeli mintázatait, érzelmi szerkezetét és a hírekkel való kapcsolatát panel regressziós, eseményvizsgálati és idősoros módszerekkel vizsgáljam.</w:t>
       </w:r>
     </w:p>
     <w:p>
@@ -8752,7 +8752,53 @@
         <w:rPr>
           <w:lang w:val="en-HU" w:eastAsia="en-GB"/>
         </w:rPr>
-        <w:t xml:space="preserve">, amely szerint a New York Times márkaemlítései vagy a hozzájuk tartozó hírsentiment tartósan befolyásolná a mémek mennyiségét vagy engagementjét. Sem az idősoros együttmozgás, sem a keresztkorreláció, sem a TWFE-modellek nem jeleztek szignifikáns vagy stabil hatást: a koefficiensek többnyire zérus körül ingadoztak, széles konfidenciaintervallumokkal. A sentiment bevonása sem módosította érdemben a mintázatokat: a hírek pozitív vagy negatív tónusa nem mutatott jelentős szerepet a későbbi mémaktivitásban. Ez arra utal, hogy a mémek mennyisége </w:t>
+        <w:t xml:space="preserve">, amely szerint a New York Times márkaemlítései vagy a hozzájuk tartozó hírsentiment tartósan befolyásolná a mémek mennyiségét vagy engagementjét. Sem az idősoros együttmozgás, sem a keresztkorreláció, sem a TWFE-modellek nem jeleztek szignifikáns vagy stabil hatást: a koefficiensek többnyire zérus körül ingadoztak, széles konfidenciaintervallumokkal. A </w:t>
+      </w:r>
+      <w:r>
+        <w:rPr>
+          <w:lang w:val="en-HU" w:eastAsia="en-GB"/>
+        </w:rPr>
+        <w:t xml:space="preserve">cikkek </w:t>
+      </w:r>
+      <w:r>
+        <w:rPr>
+          <w:lang w:val="en-HU" w:eastAsia="en-GB"/>
+        </w:rPr>
+        <w:t xml:space="preserve">sentiment bevonása sem módosította érdemben a mintázatokat: a hírek pozitív vagy negatív tónusa nem mutatott jelentős szerepet a </w:t>
+      </w:r>
+      <w:r>
+        <w:rPr>
+          <w:lang w:val="en-HU" w:eastAsia="en-GB"/>
+        </w:rPr>
+        <w:lastRenderedPageBreak/>
+        <w:t xml:space="preserve">későbbi mémaktivitásban. </w:t>
+      </w:r>
+      <w:r>
+        <w:t>A keresztkorrelációs mátrixból</w:t>
+      </w:r>
+      <w:r>
+        <w:t xml:space="preserve"> pedig</w:t>
+      </w:r>
+      <w:r>
+        <w:t xml:space="preserve"> az is egyértelműen látszott, hogy a mémekből mért sentiment szinte teljes egészében </w:t>
+      </w:r>
+      <w:r>
+        <w:rPr>
+          <w:rStyle w:val="Strong"/>
+        </w:rPr>
+        <w:t>zajként viselkedett</w:t>
+      </w:r>
+      <w:r>
+        <w:rPr>
+          <w:rStyle w:val="Strong"/>
+        </w:rPr>
+        <w:t xml:space="preserve">. </w:t>
+      </w:r>
+      <w:r>
+        <w:rPr>
+          <w:lang w:val="en-HU" w:eastAsia="en-GB"/>
+        </w:rPr>
+        <w:t xml:space="preserve">Ez arra utal, hogy a mémek mennyisége </w:t>
       </w:r>
       <w:r>
         <w:rPr>
@@ -8760,7 +8806,26 @@
           <w:bCs/>
           <w:lang w:val="en-HU" w:eastAsia="en-GB"/>
         </w:rPr>
-        <w:t xml:space="preserve">a vizsgált adatok </w:t>
+        <w:t>a vizsgált adatok alapján nem a hagyományos médiamegjelenésekhez igazodik</w:t>
+      </w:r>
+      <w:r>
+        <w:rPr>
+          <w:lang w:val="en-HU" w:eastAsia="en-GB"/>
+        </w:rPr>
+        <w:t>, hanem más, a jelen modellben nem mért tényezők szabják meg.</w:t>
+      </w:r>
+    </w:p>
+    <w:p>
+      <w:pPr>
+        <w:rPr>
+          <w:lang w:val="en-HU" w:eastAsia="en-GB"/>
+        </w:rPr>
+      </w:pPr>
+      <w:r>
+        <w:rPr>
+          <w:lang w:val="en-HU" w:eastAsia="en-GB"/>
+        </w:rPr>
+        <w:t xml:space="preserve">Ezzel szemben az eseményvizsgálatok azt mutatták, hogy a márkákhoz kapcsolódó, szokatlanul negatív hírtónusú időszakokhoz </w:t>
       </w:r>
       <w:r>
         <w:rPr>
@@ -8768,34 +8833,6 @@
           <w:bCs/>
           <w:lang w:val="en-HU" w:eastAsia="en-GB"/>
         </w:rPr>
-        <w:lastRenderedPageBreak/>
-        <w:t>alapján nem a hagyományos médiamegjelenésekhez igazodik</w:t>
-      </w:r>
-      <w:r>
-        <w:rPr>
-          <w:lang w:val="en-HU" w:eastAsia="en-GB"/>
-        </w:rPr>
-        <w:t>, hanem más, a jelen modellben nem mért tényezők szabják meg.</w:t>
-      </w:r>
-    </w:p>
-    <w:p>
-      <w:pPr>
-        <w:rPr>
-          <w:lang w:val="en-HU" w:eastAsia="en-GB"/>
-        </w:rPr>
-      </w:pPr>
-      <w:r>
-        <w:rPr>
-          <w:lang w:val="en-HU" w:eastAsia="en-GB"/>
-        </w:rPr>
-        <w:t xml:space="preserve">Ezzel szemben az eseményvizsgálatok azt mutatták, hogy a márkákhoz kapcsolódó, szokatlanul negatív hírtónusú időszakokhoz </w:t>
-      </w:r>
-      <w:r>
-        <w:rPr>
-          <w:b/>
-          <w:bCs/>
-          <w:lang w:val="en-HU" w:eastAsia="en-GB"/>
-        </w:rPr>
         <w:t>lokális mémreakció</w:t>
       </w:r>
       <w:r>
@@ -8820,36 +8857,9 @@
       </w:r>
     </w:p>
     <w:p>
-      <w:pPr>
-        <w:rPr>
-          <w:lang w:val="en-HU" w:eastAsia="en-GB"/>
-        </w:rPr>
-      </w:pPr>
-      <w:r>
-        <w:rPr>
-          <w:lang w:val="en-HU" w:eastAsia="en-GB"/>
-        </w:rPr>
-        <w:t xml:space="preserve">Összességében a kutatás azt mutatja, hogy a márkák mémekben való megjelenése </w:t>
-      </w:r>
-      <w:r>
-        <w:rPr>
-          <w:b/>
-          <w:bCs/>
-          <w:lang w:val="en-HU" w:eastAsia="en-GB"/>
-        </w:rPr>
-        <w:t>nagyrészt autonóm folyamat</w:t>
-      </w:r>
-      <w:r>
-        <w:rPr>
-          <w:lang w:val="en-HU" w:eastAsia="en-GB"/>
-        </w:rPr>
-        <w:t>, amelyet a hagyományos hírmédia nem magyaráz kielégítően. A mémvolumen és az engagement mintázatai erősen epizodikusak, márkánként eltérőek, és nem illeszkednek stabil médiavisszhang-dinamikához. A vizsgált marketing- és kommunikációs mutatók alapján a mémkultúrában megjelenő márkatrendek spontánul formálódnak, és csak bizonyos extrém negatív híresemények esetén mutatnak látható összefüggést a sajtóval. A dolgozat eredményei így rávilágítanak arra, hogy a mémekben kirajzolódó márkaképet a közösségi tér saját logikája határozza meg, és a hagyományos médiától való függetlenségük meghatározó eleme ennek az új kommunikációs ökoszisztémának.</w:t>
-      </w:r>
-    </w:p>
-    <w:p>
-      <w:pPr>
-        <w:ind w:firstLine="0"/>
-      </w:pPr>
+      <w:r>
+        <w:t>Összességében a kutatás arra mutat rá, hogy a márkák mémekben való megjelenése a vizsgált időszakban nem követi a hagyományos médiamegjelenések logikáját, és a mémkultúra önálló kommunikációs viselkedést mutat, amely eltér a hírszövegek ritmusától és érzelmi mintázatától.</w:t>
+      </w:r>
     </w:p>
     <w:p>
       <w:pPr>

</xml_diff>